<commit_message>
agregando filtrado or categorias
</commit_message>
<xml_diff>
--- a/relacion de archivos.docx
+++ b/relacion de archivos.docx
@@ -21135,64 +21135,1828 @@
         <w:spacing w:before="100" w:beforeAutospacing="1" w:after="100" w:afterAutospacing="1" w:line="240" w:lineRule="auto"/>
         <w:rPr>
           <w:rFonts w:ascii="Times New Roman" w:eastAsia="Times New Roman" w:hAnsi="Times New Roman" w:cs="Times New Roman"/>
-          <w:sz w:val="24"/>
-          <w:szCs w:val="24"/>
-          <w:lang w:eastAsia="es-419"/>
-        </w:rPr>
-      </w:pPr>
-      <w:r>
-        <w:rPr>
-          <w:rFonts w:ascii="Times New Roman" w:eastAsia="Times New Roman" w:hAnsi="Times New Roman" w:cs="Times New Roman"/>
-          <w:sz w:val="24"/>
-          <w:szCs w:val="24"/>
-          <w:lang w:eastAsia="es-419"/>
-        </w:rPr>
-        <w:t>Eso te lleva a nivel CMS serio.</w:t>
-      </w:r>
-    </w:p>
-    <w:p>
-      <w:pPr>
-        <w:spacing w:before="100" w:beforeAutospacing="1" w:after="100" w:afterAutospacing="1" w:line="240" w:lineRule="auto"/>
-        <w:rPr>
-          <w:rFonts w:ascii="Times New Roman" w:eastAsia="Times New Roman" w:hAnsi="Times New Roman" w:cs="Times New Roman"/>
-          <w:sz w:val="24"/>
-          <w:szCs w:val="24"/>
-          <w:lang w:eastAsia="es-419"/>
-        </w:rPr>
-      </w:pPr>
-      <w:r>
-        <w:rPr>
-          <w:rFonts w:ascii="Times New Roman" w:eastAsia="Times New Roman" w:hAnsi="Times New Roman" w:cs="Times New Roman"/>
-          <w:sz w:val="24"/>
-          <w:szCs w:val="24"/>
-          <w:lang w:eastAsia="es-419"/>
-        </w:rPr>
-        <w:t xml:space="preserve">¿Arrancamos por </w:t>
-      </w:r>
-      <w:proofErr w:type="spellStart"/>
-      <w:r>
-        <w:rPr>
-          <w:rFonts w:ascii="Times New Roman" w:eastAsia="Times New Roman" w:hAnsi="Times New Roman" w:cs="Times New Roman"/>
-          <w:sz w:val="24"/>
-          <w:szCs w:val="24"/>
-          <w:lang w:eastAsia="es-419"/>
-        </w:rPr>
-        <w:t>slugs</w:t>
-      </w:r>
-      <w:proofErr w:type="spellEnd"/>
-      <w:r>
-        <w:rPr>
-          <w:rFonts w:ascii="Times New Roman" w:eastAsia="Times New Roman" w:hAnsi="Times New Roman" w:cs="Times New Roman"/>
-          <w:sz w:val="24"/>
-          <w:szCs w:val="24"/>
-          <w:lang w:eastAsia="es-419"/>
-        </w:rPr>
-        <w:t>?</w:t>
-      </w:r>
-    </w:p>
-    <w:p>
-      <w:pPr>
-        <w:spacing w:before="100" w:beforeAutospacing="1" w:after="100" w:afterAutospacing="1" w:line="240" w:lineRule="auto"/>
+          <w:sz w:val="56"/>
+          <w:szCs w:val="56"/>
+          <w:lang w:eastAsia="es-419"/>
+        </w:rPr>
+      </w:pPr>
+      <w:r>
+        <w:rPr>
+          <w:rFonts w:ascii="Times New Roman" w:eastAsia="Times New Roman" w:hAnsi="Times New Roman" w:cs="Times New Roman"/>
+          <w:sz w:val="56"/>
+          <w:szCs w:val="56"/>
+          <w:lang w:eastAsia="es-419"/>
+        </w:rPr>
+        <w:t>4TO RESUMEN</w:t>
+      </w:r>
+    </w:p>
+    <w:p>
+      <w:pPr>
+        <w:spacing w:before="100" w:beforeAutospacing="1" w:after="100" w:afterAutospacing="1" w:line="240" w:lineRule="auto"/>
+        <w:rPr>
+          <w:rFonts w:ascii="Times New Roman" w:eastAsia="Times New Roman" w:hAnsi="Times New Roman" w:cs="Times New Roman"/>
+          <w:sz w:val="24"/>
+          <w:szCs w:val="24"/>
+          <w:lang w:eastAsia="es-419"/>
+        </w:rPr>
+      </w:pPr>
+      <w:proofErr w:type="spellStart"/>
+      <w:r>
+        <w:rPr>
+          <w:rFonts w:ascii="Times New Roman" w:eastAsia="Times New Roman" w:hAnsi="Times New Roman" w:cs="Times New Roman"/>
+          <w:sz w:val="24"/>
+          <w:szCs w:val="24"/>
+          <w:lang w:eastAsia="es-419"/>
+        </w:rPr>
+        <w:t>Tenés</w:t>
+      </w:r>
+      <w:proofErr w:type="spellEnd"/>
+      <w:r>
+        <w:rPr>
+          <w:rFonts w:ascii="Times New Roman" w:eastAsia="Times New Roman" w:hAnsi="Times New Roman" w:cs="Times New Roman"/>
+          <w:sz w:val="24"/>
+          <w:szCs w:val="24"/>
+          <w:lang w:eastAsia="es-419"/>
+        </w:rPr>
+        <w:t>:</w:t>
+      </w:r>
+    </w:p>
+    <w:p>
+      <w:pPr>
+        <w:numPr>
+          <w:ilvl w:val="0"/>
+          <w:numId w:val="28"/>
+        </w:numPr>
+        <w:spacing w:before="100" w:beforeAutospacing="1" w:after="100" w:afterAutospacing="1" w:line="240" w:lineRule="auto"/>
+        <w:rPr>
+          <w:rFonts w:ascii="Times New Roman" w:eastAsia="Times New Roman" w:hAnsi="Times New Roman" w:cs="Times New Roman"/>
+          <w:sz w:val="24"/>
+          <w:szCs w:val="24"/>
+          <w:lang w:eastAsia="es-419"/>
+        </w:rPr>
+      </w:pPr>
+      <w:r>
+        <w:rPr>
+          <w:rFonts w:ascii="Segoe UI Symbol" w:eastAsia="Times New Roman" w:hAnsi="Segoe UI Symbol" w:cs="Segoe UI Symbol"/>
+          <w:sz w:val="24"/>
+          <w:szCs w:val="24"/>
+          <w:lang w:eastAsia="es-419"/>
+        </w:rPr>
+        <w:t>✅</w:t>
+      </w:r>
+      <w:r>
+        <w:rPr>
+          <w:rFonts w:ascii="Times New Roman" w:eastAsia="Times New Roman" w:hAnsi="Times New Roman" w:cs="Times New Roman"/>
+          <w:sz w:val="24"/>
+          <w:szCs w:val="24"/>
+          <w:lang w:eastAsia="es-419"/>
+        </w:rPr>
+        <w:t xml:space="preserve"> </w:t>
+      </w:r>
+      <w:proofErr w:type="spellStart"/>
+      <w:r>
+        <w:rPr>
+          <w:rFonts w:ascii="Times New Roman" w:eastAsia="Times New Roman" w:hAnsi="Times New Roman" w:cs="Times New Roman"/>
+          <w:sz w:val="24"/>
+          <w:szCs w:val="24"/>
+          <w:lang w:eastAsia="es-419"/>
+        </w:rPr>
+        <w:t>Slugs</w:t>
+      </w:r>
+      <w:proofErr w:type="spellEnd"/>
+      <w:r>
+        <w:rPr>
+          <w:rFonts w:ascii="Times New Roman" w:eastAsia="Times New Roman" w:hAnsi="Times New Roman" w:cs="Times New Roman"/>
+          <w:sz w:val="24"/>
+          <w:szCs w:val="24"/>
+          <w:lang w:eastAsia="es-419"/>
+        </w:rPr>
+        <w:t xml:space="preserve"> automáticos únicos</w:t>
+      </w:r>
+    </w:p>
+    <w:p>
+      <w:pPr>
+        <w:numPr>
+          <w:ilvl w:val="0"/>
+          <w:numId w:val="28"/>
+        </w:numPr>
+        <w:spacing w:before="100" w:beforeAutospacing="1" w:after="100" w:afterAutospacing="1" w:line="240" w:lineRule="auto"/>
+        <w:rPr>
+          <w:rFonts w:ascii="Times New Roman" w:eastAsia="Times New Roman" w:hAnsi="Times New Roman" w:cs="Times New Roman"/>
+          <w:sz w:val="24"/>
+          <w:szCs w:val="24"/>
+          <w:lang w:eastAsia="es-419"/>
+        </w:rPr>
+      </w:pPr>
+      <w:r>
+        <w:rPr>
+          <w:rFonts w:ascii="Segoe UI Symbol" w:eastAsia="Times New Roman" w:hAnsi="Segoe UI Symbol" w:cs="Segoe UI Symbol"/>
+          <w:sz w:val="24"/>
+          <w:szCs w:val="24"/>
+          <w:lang w:eastAsia="es-419"/>
+        </w:rPr>
+        <w:t>✅</w:t>
+      </w:r>
+      <w:r>
+        <w:rPr>
+          <w:rFonts w:ascii="Times New Roman" w:eastAsia="Times New Roman" w:hAnsi="Times New Roman" w:cs="Times New Roman"/>
+          <w:sz w:val="24"/>
+          <w:szCs w:val="24"/>
+          <w:lang w:eastAsia="es-419"/>
+        </w:rPr>
+        <w:t xml:space="preserve"> Relación Post ↔ Categoría funcionando</w:t>
+      </w:r>
+    </w:p>
+    <w:p>
+      <w:pPr>
+        <w:numPr>
+          <w:ilvl w:val="0"/>
+          <w:numId w:val="28"/>
+        </w:numPr>
+        <w:spacing w:before="100" w:beforeAutospacing="1" w:after="100" w:afterAutospacing="1" w:line="240" w:lineRule="auto"/>
+        <w:rPr>
+          <w:rFonts w:ascii="Times New Roman" w:eastAsia="Times New Roman" w:hAnsi="Times New Roman" w:cs="Times New Roman"/>
+          <w:sz w:val="24"/>
+          <w:szCs w:val="24"/>
+          <w:lang w:eastAsia="es-419"/>
+        </w:rPr>
+      </w:pPr>
+      <w:r>
+        <w:rPr>
+          <w:rFonts w:ascii="Segoe UI Symbol" w:eastAsia="Times New Roman" w:hAnsi="Segoe UI Symbol" w:cs="Segoe UI Symbol"/>
+          <w:sz w:val="24"/>
+          <w:szCs w:val="24"/>
+          <w:lang w:eastAsia="es-419"/>
+        </w:rPr>
+        <w:t>✅</w:t>
+      </w:r>
+      <w:r>
+        <w:rPr>
+          <w:rFonts w:ascii="Times New Roman" w:eastAsia="Times New Roman" w:hAnsi="Times New Roman" w:cs="Times New Roman"/>
+          <w:sz w:val="24"/>
+          <w:szCs w:val="24"/>
+          <w:lang w:eastAsia="es-419"/>
+        </w:rPr>
+        <w:t xml:space="preserve"> </w:t>
+      </w:r>
+      <w:proofErr w:type="spellStart"/>
+      <w:r>
+        <w:rPr>
+          <w:rFonts w:ascii="Times New Roman" w:eastAsia="Times New Roman" w:hAnsi="Times New Roman" w:cs="Times New Roman"/>
+          <w:sz w:val="24"/>
+          <w:szCs w:val="24"/>
+          <w:lang w:eastAsia="es-419"/>
+        </w:rPr>
+        <w:t>Select</w:t>
+      </w:r>
+      <w:proofErr w:type="spellEnd"/>
+      <w:r>
+        <w:rPr>
+          <w:rFonts w:ascii="Times New Roman" w:eastAsia="Times New Roman" w:hAnsi="Times New Roman" w:cs="Times New Roman"/>
+          <w:sz w:val="24"/>
+          <w:szCs w:val="24"/>
+          <w:lang w:eastAsia="es-419"/>
+        </w:rPr>
+        <w:t xml:space="preserve"> dinámico conectado a BD</w:t>
+      </w:r>
+    </w:p>
+    <w:p>
+      <w:pPr>
+        <w:numPr>
+          <w:ilvl w:val="0"/>
+          <w:numId w:val="28"/>
+        </w:numPr>
+        <w:spacing w:before="100" w:beforeAutospacing="1" w:after="100" w:afterAutospacing="1" w:line="240" w:lineRule="auto"/>
+        <w:rPr>
+          <w:rFonts w:ascii="Times New Roman" w:eastAsia="Times New Roman" w:hAnsi="Times New Roman" w:cs="Times New Roman"/>
+          <w:sz w:val="24"/>
+          <w:szCs w:val="24"/>
+          <w:lang w:eastAsia="es-419"/>
+        </w:rPr>
+      </w:pPr>
+      <w:r>
+        <w:rPr>
+          <w:rFonts w:ascii="Segoe UI Symbol" w:eastAsia="Times New Roman" w:hAnsi="Segoe UI Symbol" w:cs="Segoe UI Symbol"/>
+          <w:sz w:val="24"/>
+          <w:szCs w:val="24"/>
+          <w:lang w:eastAsia="es-419"/>
+        </w:rPr>
+        <w:t>✅</w:t>
+      </w:r>
+      <w:r>
+        <w:rPr>
+          <w:rFonts w:ascii="Times New Roman" w:eastAsia="Times New Roman" w:hAnsi="Times New Roman" w:cs="Times New Roman"/>
+          <w:sz w:val="24"/>
+          <w:szCs w:val="24"/>
+          <w:lang w:eastAsia="es-419"/>
+        </w:rPr>
+        <w:t xml:space="preserve"> CRUD completo</w:t>
+      </w:r>
+    </w:p>
+    <w:p>
+      <w:pPr>
+        <w:numPr>
+          <w:ilvl w:val="0"/>
+          <w:numId w:val="28"/>
+        </w:numPr>
+        <w:spacing w:before="100" w:beforeAutospacing="1" w:after="100" w:afterAutospacing="1" w:line="240" w:lineRule="auto"/>
+        <w:rPr>
+          <w:rFonts w:ascii="Times New Roman" w:eastAsia="Times New Roman" w:hAnsi="Times New Roman" w:cs="Times New Roman"/>
+          <w:sz w:val="24"/>
+          <w:szCs w:val="24"/>
+          <w:lang w:eastAsia="es-419"/>
+        </w:rPr>
+      </w:pPr>
+      <w:r>
+        <w:rPr>
+          <w:rFonts w:ascii="Segoe UI Symbol" w:eastAsia="Times New Roman" w:hAnsi="Segoe UI Symbol" w:cs="Segoe UI Symbol"/>
+          <w:sz w:val="24"/>
+          <w:szCs w:val="24"/>
+          <w:lang w:eastAsia="es-419"/>
+        </w:rPr>
+        <w:t>✅</w:t>
+      </w:r>
+      <w:r>
+        <w:rPr>
+          <w:rFonts w:ascii="Times New Roman" w:eastAsia="Times New Roman" w:hAnsi="Times New Roman" w:cs="Times New Roman"/>
+          <w:sz w:val="24"/>
+          <w:szCs w:val="24"/>
+          <w:lang w:eastAsia="es-419"/>
+        </w:rPr>
+        <w:t xml:space="preserve"> </w:t>
+      </w:r>
+      <w:proofErr w:type="spellStart"/>
+      <w:r>
+        <w:rPr>
+          <w:rFonts w:ascii="Times New Roman" w:eastAsia="Times New Roman" w:hAnsi="Times New Roman" w:cs="Times New Roman"/>
+          <w:sz w:val="24"/>
+          <w:szCs w:val="24"/>
+          <w:lang w:eastAsia="es-419"/>
+        </w:rPr>
+        <w:t>Render</w:t>
+      </w:r>
+      <w:proofErr w:type="spellEnd"/>
+      <w:r>
+        <w:rPr>
+          <w:rFonts w:ascii="Times New Roman" w:eastAsia="Times New Roman" w:hAnsi="Times New Roman" w:cs="Times New Roman"/>
+          <w:sz w:val="24"/>
+          <w:szCs w:val="24"/>
+          <w:lang w:eastAsia="es-419"/>
+        </w:rPr>
+        <w:t xml:space="preserve"> público correcto</w:t>
+      </w:r>
+    </w:p>
+    <w:p>
+      <w:pPr>
+        <w:numPr>
+          <w:ilvl w:val="0"/>
+          <w:numId w:val="28"/>
+        </w:numPr>
+        <w:spacing w:before="100" w:beforeAutospacing="1" w:after="100" w:afterAutospacing="1" w:line="240" w:lineRule="auto"/>
+        <w:rPr>
+          <w:rFonts w:ascii="Times New Roman" w:eastAsia="Times New Roman" w:hAnsi="Times New Roman" w:cs="Times New Roman"/>
+          <w:sz w:val="24"/>
+          <w:szCs w:val="24"/>
+          <w:lang w:eastAsia="es-419"/>
+        </w:rPr>
+      </w:pPr>
+      <w:r>
+        <w:rPr>
+          <w:rFonts w:ascii="Segoe UI Symbol" w:eastAsia="Times New Roman" w:hAnsi="Segoe UI Symbol" w:cs="Segoe UI Symbol"/>
+          <w:sz w:val="24"/>
+          <w:szCs w:val="24"/>
+          <w:lang w:eastAsia="es-419"/>
+        </w:rPr>
+        <w:t>✅</w:t>
+      </w:r>
+      <w:r>
+        <w:rPr>
+          <w:rFonts w:ascii="Times New Roman" w:eastAsia="Times New Roman" w:hAnsi="Times New Roman" w:cs="Times New Roman"/>
+          <w:sz w:val="24"/>
+          <w:szCs w:val="24"/>
+          <w:lang w:eastAsia="es-419"/>
+        </w:rPr>
+        <w:t xml:space="preserve"> </w:t>
+      </w:r>
+      <w:proofErr w:type="spellStart"/>
+      <w:r>
+        <w:rPr>
+          <w:rFonts w:ascii="Times New Roman" w:eastAsia="Times New Roman" w:hAnsi="Times New Roman" w:cs="Times New Roman"/>
+          <w:sz w:val="24"/>
+          <w:szCs w:val="24"/>
+          <w:lang w:eastAsia="es-419"/>
+        </w:rPr>
+        <w:t>Admin</w:t>
+      </w:r>
+      <w:proofErr w:type="spellEnd"/>
+      <w:r>
+        <w:rPr>
+          <w:rFonts w:ascii="Times New Roman" w:eastAsia="Times New Roman" w:hAnsi="Times New Roman" w:cs="Times New Roman"/>
+          <w:sz w:val="24"/>
+          <w:szCs w:val="24"/>
+          <w:lang w:eastAsia="es-419"/>
+        </w:rPr>
+        <w:t xml:space="preserve"> estable</w:t>
+      </w:r>
+    </w:p>
+    <w:p>
+      <w:pPr>
+        <w:numPr>
+          <w:ilvl w:val="0"/>
+          <w:numId w:val="28"/>
+        </w:numPr>
+        <w:spacing w:before="100" w:beforeAutospacing="1" w:after="100" w:afterAutospacing="1" w:line="240" w:lineRule="auto"/>
+        <w:rPr>
+          <w:rFonts w:ascii="Times New Roman" w:eastAsia="Times New Roman" w:hAnsi="Times New Roman" w:cs="Times New Roman"/>
+          <w:sz w:val="24"/>
+          <w:szCs w:val="24"/>
+          <w:lang w:eastAsia="es-419"/>
+        </w:rPr>
+      </w:pPr>
+      <w:r>
+        <w:rPr>
+          <w:rFonts w:ascii="Segoe UI Symbol" w:eastAsia="Times New Roman" w:hAnsi="Segoe UI Symbol" w:cs="Segoe UI Symbol"/>
+          <w:sz w:val="24"/>
+          <w:szCs w:val="24"/>
+          <w:lang w:eastAsia="es-419"/>
+        </w:rPr>
+        <w:t>✅</w:t>
+      </w:r>
+      <w:r>
+        <w:rPr>
+          <w:rFonts w:ascii="Times New Roman" w:eastAsia="Times New Roman" w:hAnsi="Times New Roman" w:cs="Times New Roman"/>
+          <w:sz w:val="24"/>
+          <w:szCs w:val="24"/>
+          <w:lang w:eastAsia="es-419"/>
+        </w:rPr>
+        <w:t xml:space="preserve"> Sin errores de compilación</w:t>
+      </w:r>
+    </w:p>
+    <w:p>
+      <w:pPr>
+        <w:spacing w:before="100" w:beforeAutospacing="1" w:after="100" w:afterAutospacing="1" w:line="240" w:lineRule="auto"/>
+        <w:rPr>
+          <w:rFonts w:ascii="Times New Roman" w:eastAsia="Times New Roman" w:hAnsi="Times New Roman" w:cs="Times New Roman"/>
+          <w:sz w:val="24"/>
+          <w:szCs w:val="24"/>
+          <w:lang w:eastAsia="es-419"/>
+        </w:rPr>
+      </w:pPr>
+      <w:r>
+        <w:rPr>
+          <w:rFonts w:ascii="Times New Roman" w:eastAsia="Times New Roman" w:hAnsi="Times New Roman" w:cs="Times New Roman"/>
+          <w:sz w:val="24"/>
+          <w:szCs w:val="24"/>
+          <w:lang w:eastAsia="es-419"/>
+        </w:rPr>
+        <w:t>Eso ya es un CMS real, no un prototipo.</w:t>
+      </w:r>
+    </w:p>
+    <w:p>
+      <w:pPr>
+        <w:spacing w:after="0" w:line="240" w:lineRule="auto"/>
+        <w:rPr>
+          <w:rFonts w:ascii="Times New Roman" w:eastAsia="Times New Roman" w:hAnsi="Times New Roman" w:cs="Times New Roman"/>
+          <w:sz w:val="24"/>
+          <w:szCs w:val="24"/>
+          <w:lang w:eastAsia="es-419"/>
+        </w:rPr>
+      </w:pPr>
+      <w:r>
+        <w:rPr>
+          <w:rFonts w:ascii="Times New Roman" w:eastAsia="Times New Roman" w:hAnsi="Times New Roman" w:cs="Times New Roman"/>
+          <w:sz w:val="24"/>
+          <w:szCs w:val="24"/>
+          <w:lang w:eastAsia="es-419"/>
+        </w:rPr>
+        <w:pict>
+          <v:rect id="_x0000_i1087" style="width:0;height:1.5pt" o:hralign="center" o:hrstd="t" o:hr="t" fillcolor="#a0a0a0" stroked="f"/>
+        </w:pict>
+      </w:r>
+    </w:p>
+    <w:p>
+      <w:pPr>
+        <w:spacing w:before="100" w:beforeAutospacing="1" w:after="100" w:afterAutospacing="1" w:line="240" w:lineRule="auto"/>
+        <w:outlineLvl w:val="0"/>
+        <w:rPr>
+          <w:rFonts w:ascii="Times New Roman" w:eastAsia="Times New Roman" w:hAnsi="Times New Roman" w:cs="Times New Roman"/>
+          <w:b/>
+          <w:bCs/>
+          <w:kern w:val="36"/>
+          <w:sz w:val="48"/>
+          <w:szCs w:val="48"/>
+          <w:lang w:eastAsia="es-419"/>
+        </w:rPr>
+      </w:pPr>
+      <w:r>
+        <w:rPr>
+          <w:rFonts w:ascii="Times New Roman" w:eastAsia="Times New Roman" w:hAnsi="Times New Roman" w:cs="Times New Roman"/>
+          <w:b/>
+          <w:bCs/>
+          <w:kern w:val="36"/>
+          <w:sz w:val="48"/>
+          <w:szCs w:val="48"/>
+          <w:lang w:eastAsia="es-419"/>
+        </w:rPr>
+        <w:t xml:space="preserve">🧠 Lo que </w:t>
+      </w:r>
+      <w:proofErr w:type="spellStart"/>
+      <w:r>
+        <w:rPr>
+          <w:rFonts w:ascii="Times New Roman" w:eastAsia="Times New Roman" w:hAnsi="Times New Roman" w:cs="Times New Roman"/>
+          <w:b/>
+          <w:bCs/>
+          <w:kern w:val="36"/>
+          <w:sz w:val="48"/>
+          <w:szCs w:val="48"/>
+          <w:lang w:eastAsia="es-419"/>
+        </w:rPr>
+        <w:t>acabás</w:t>
+      </w:r>
+      <w:proofErr w:type="spellEnd"/>
+      <w:r>
+        <w:rPr>
+          <w:rFonts w:ascii="Times New Roman" w:eastAsia="Times New Roman" w:hAnsi="Times New Roman" w:cs="Times New Roman"/>
+          <w:b/>
+          <w:bCs/>
+          <w:kern w:val="36"/>
+          <w:sz w:val="48"/>
+          <w:szCs w:val="48"/>
+          <w:lang w:eastAsia="es-419"/>
+        </w:rPr>
+        <w:t xml:space="preserve"> de construir técnicamente</w:t>
+      </w:r>
+    </w:p>
+    <w:p>
+      <w:pPr>
+        <w:spacing w:before="100" w:beforeAutospacing="1" w:after="100" w:afterAutospacing="1" w:line="240" w:lineRule="auto"/>
+        <w:rPr>
+          <w:rFonts w:ascii="Times New Roman" w:eastAsia="Times New Roman" w:hAnsi="Times New Roman" w:cs="Times New Roman"/>
+          <w:sz w:val="24"/>
+          <w:szCs w:val="24"/>
+          <w:lang w:eastAsia="es-419"/>
+        </w:rPr>
+      </w:pPr>
+      <w:r>
+        <w:rPr>
+          <w:rFonts w:ascii="Times New Roman" w:eastAsia="Times New Roman" w:hAnsi="Times New Roman" w:cs="Times New Roman"/>
+          <w:sz w:val="24"/>
+          <w:szCs w:val="24"/>
+          <w:lang w:eastAsia="es-419"/>
+        </w:rPr>
+        <w:t>Tu arquitectura ahora es:</w:t>
+      </w:r>
+    </w:p>
+    <w:p>
+      <w:pPr>
+        <w:tabs>
+          <w:tab w:val="left" w:pos="916"/>
+          <w:tab w:val="left" w:pos="1832"/>
+          <w:tab w:val="left" w:pos="2748"/>
+          <w:tab w:val="left" w:pos="3664"/>
+          <w:tab w:val="left" w:pos="4580"/>
+          <w:tab w:val="left" w:pos="5496"/>
+          <w:tab w:val="left" w:pos="6412"/>
+          <w:tab w:val="left" w:pos="7328"/>
+          <w:tab w:val="left" w:pos="8244"/>
+          <w:tab w:val="left" w:pos="9160"/>
+          <w:tab w:val="left" w:pos="10076"/>
+          <w:tab w:val="left" w:pos="10992"/>
+          <w:tab w:val="left" w:pos="11908"/>
+          <w:tab w:val="left" w:pos="12824"/>
+          <w:tab w:val="left" w:pos="13740"/>
+          <w:tab w:val="left" w:pos="14656"/>
+        </w:tabs>
+        <w:spacing w:after="0" w:line="240" w:lineRule="auto"/>
+        <w:rPr>
+          <w:rFonts w:ascii="Courier New" w:eastAsia="Times New Roman" w:hAnsi="Courier New" w:cs="Courier New"/>
+          <w:sz w:val="20"/>
+          <w:szCs w:val="20"/>
+          <w:lang w:eastAsia="es-419"/>
+        </w:rPr>
+      </w:pPr>
+      <w:proofErr w:type="spellStart"/>
+      <w:r>
+        <w:rPr>
+          <w:rFonts w:ascii="Courier New" w:eastAsia="Times New Roman" w:hAnsi="Courier New" w:cs="Courier New"/>
+          <w:sz w:val="20"/>
+          <w:szCs w:val="20"/>
+          <w:lang w:eastAsia="es-419"/>
+        </w:rPr>
+        <w:t>models</w:t>
+      </w:r>
+      <w:proofErr w:type="spellEnd"/>
+      <w:r>
+        <w:rPr>
+          <w:rFonts w:ascii="Courier New" w:eastAsia="Times New Roman" w:hAnsi="Courier New" w:cs="Courier New"/>
+          <w:sz w:val="20"/>
+          <w:szCs w:val="20"/>
+          <w:lang w:eastAsia="es-419"/>
+        </w:rPr>
+        <w:t>/</w:t>
+      </w:r>
+      <w:r>
+        <w:rPr>
+          <w:rFonts w:ascii="Courier New" w:eastAsia="Times New Roman" w:hAnsi="Courier New" w:cs="Courier New"/>
+          <w:sz w:val="20"/>
+          <w:szCs w:val="20"/>
+          <w:lang w:eastAsia="es-419"/>
+        </w:rPr>
+        <w:br/>
+        <w:t xml:space="preserve">    Post</w:t>
+      </w:r>
+      <w:r>
+        <w:rPr>
+          <w:rFonts w:ascii="Courier New" w:eastAsia="Times New Roman" w:hAnsi="Courier New" w:cs="Courier New"/>
+          <w:sz w:val="20"/>
+          <w:szCs w:val="20"/>
+          <w:lang w:eastAsia="es-419"/>
+        </w:rPr>
+        <w:br/>
+        <w:t xml:space="preserve">    </w:t>
+      </w:r>
+      <w:proofErr w:type="spellStart"/>
+      <w:r>
+        <w:rPr>
+          <w:rFonts w:ascii="Courier New" w:eastAsia="Times New Roman" w:hAnsi="Courier New" w:cs="Courier New"/>
+          <w:sz w:val="20"/>
+          <w:szCs w:val="20"/>
+          <w:lang w:eastAsia="es-419"/>
+        </w:rPr>
+        <w:t>Category</w:t>
+      </w:r>
+      <w:proofErr w:type="spellEnd"/>
+      <w:r>
+        <w:rPr>
+          <w:rFonts w:ascii="Courier New" w:eastAsia="Times New Roman" w:hAnsi="Courier New" w:cs="Courier New"/>
+          <w:sz w:val="20"/>
+          <w:szCs w:val="20"/>
+          <w:lang w:eastAsia="es-419"/>
+        </w:rPr>
+        <w:br/>
+      </w:r>
+      <w:r>
+        <w:rPr>
+          <w:rFonts w:ascii="Courier New" w:eastAsia="Times New Roman" w:hAnsi="Courier New" w:cs="Courier New"/>
+          <w:sz w:val="20"/>
+          <w:szCs w:val="20"/>
+          <w:lang w:eastAsia="es-419"/>
+        </w:rPr>
+        <w:br/>
+      </w:r>
+      <w:proofErr w:type="spellStart"/>
+      <w:r>
+        <w:rPr>
+          <w:rFonts w:ascii="Courier New" w:eastAsia="Times New Roman" w:hAnsi="Courier New" w:cs="Courier New"/>
+          <w:sz w:val="20"/>
+          <w:szCs w:val="20"/>
+          <w:lang w:eastAsia="es-419"/>
+        </w:rPr>
+        <w:t>services</w:t>
+      </w:r>
+      <w:proofErr w:type="spellEnd"/>
+      <w:r>
+        <w:rPr>
+          <w:rFonts w:ascii="Courier New" w:eastAsia="Times New Roman" w:hAnsi="Courier New" w:cs="Courier New"/>
+          <w:sz w:val="20"/>
+          <w:szCs w:val="20"/>
+          <w:lang w:eastAsia="es-419"/>
+        </w:rPr>
+        <w:t>/</w:t>
+      </w:r>
+      <w:r>
+        <w:rPr>
+          <w:rFonts w:ascii="Courier New" w:eastAsia="Times New Roman" w:hAnsi="Courier New" w:cs="Courier New"/>
+          <w:sz w:val="20"/>
+          <w:szCs w:val="20"/>
+          <w:lang w:eastAsia="es-419"/>
+        </w:rPr>
+        <w:br/>
+        <w:t xml:space="preserve">    post_service.py</w:t>
+      </w:r>
+      <w:r>
+        <w:rPr>
+          <w:rFonts w:ascii="Courier New" w:eastAsia="Times New Roman" w:hAnsi="Courier New" w:cs="Courier New"/>
+          <w:sz w:val="20"/>
+          <w:szCs w:val="20"/>
+          <w:lang w:eastAsia="es-419"/>
+        </w:rPr>
+        <w:br/>
+        <w:t xml:space="preserve">    category_service.py</w:t>
+      </w:r>
+      <w:r>
+        <w:rPr>
+          <w:rFonts w:ascii="Courier New" w:eastAsia="Times New Roman" w:hAnsi="Courier New" w:cs="Courier New"/>
+          <w:sz w:val="20"/>
+          <w:szCs w:val="20"/>
+          <w:lang w:eastAsia="es-419"/>
+        </w:rPr>
+        <w:br/>
+      </w:r>
+      <w:r>
+        <w:rPr>
+          <w:rFonts w:ascii="Courier New" w:eastAsia="Times New Roman" w:hAnsi="Courier New" w:cs="Courier New"/>
+          <w:sz w:val="20"/>
+          <w:szCs w:val="20"/>
+          <w:lang w:eastAsia="es-419"/>
+        </w:rPr>
+        <w:br/>
+      </w:r>
+      <w:proofErr w:type="spellStart"/>
+      <w:r>
+        <w:rPr>
+          <w:rFonts w:ascii="Courier New" w:eastAsia="Times New Roman" w:hAnsi="Courier New" w:cs="Courier New"/>
+          <w:sz w:val="20"/>
+          <w:szCs w:val="20"/>
+          <w:lang w:eastAsia="es-419"/>
+        </w:rPr>
+        <w:t>states</w:t>
+      </w:r>
+      <w:proofErr w:type="spellEnd"/>
+      <w:r>
+        <w:rPr>
+          <w:rFonts w:ascii="Courier New" w:eastAsia="Times New Roman" w:hAnsi="Courier New" w:cs="Courier New"/>
+          <w:sz w:val="20"/>
+          <w:szCs w:val="20"/>
+          <w:lang w:eastAsia="es-419"/>
+        </w:rPr>
+        <w:t>/</w:t>
+      </w:r>
+      <w:r>
+        <w:rPr>
+          <w:rFonts w:ascii="Courier New" w:eastAsia="Times New Roman" w:hAnsi="Courier New" w:cs="Courier New"/>
+          <w:sz w:val="20"/>
+          <w:szCs w:val="20"/>
+          <w:lang w:eastAsia="es-419"/>
+        </w:rPr>
+        <w:br/>
+        <w:t xml:space="preserve">    </w:t>
+      </w:r>
+      <w:proofErr w:type="spellStart"/>
+      <w:r>
+        <w:rPr>
+          <w:rFonts w:ascii="Courier New" w:eastAsia="Times New Roman" w:hAnsi="Courier New" w:cs="Courier New"/>
+          <w:sz w:val="20"/>
+          <w:szCs w:val="20"/>
+          <w:lang w:eastAsia="es-419"/>
+        </w:rPr>
+        <w:t>PostState</w:t>
+      </w:r>
+      <w:proofErr w:type="spellEnd"/>
+      <w:r>
+        <w:rPr>
+          <w:rFonts w:ascii="Courier New" w:eastAsia="Times New Roman" w:hAnsi="Courier New" w:cs="Courier New"/>
+          <w:sz w:val="20"/>
+          <w:szCs w:val="20"/>
+          <w:lang w:eastAsia="es-419"/>
+        </w:rPr>
+        <w:br/>
+        <w:t xml:space="preserve">    </w:t>
+      </w:r>
+      <w:proofErr w:type="spellStart"/>
+      <w:r>
+        <w:rPr>
+          <w:rFonts w:ascii="Courier New" w:eastAsia="Times New Roman" w:hAnsi="Courier New" w:cs="Courier New"/>
+          <w:sz w:val="20"/>
+          <w:szCs w:val="20"/>
+          <w:lang w:eastAsia="es-419"/>
+        </w:rPr>
+        <w:t>PublicState</w:t>
+      </w:r>
+      <w:proofErr w:type="spellEnd"/>
+      <w:r>
+        <w:rPr>
+          <w:rFonts w:ascii="Courier New" w:eastAsia="Times New Roman" w:hAnsi="Courier New" w:cs="Courier New"/>
+          <w:sz w:val="20"/>
+          <w:szCs w:val="20"/>
+          <w:lang w:eastAsia="es-419"/>
+        </w:rPr>
+        <w:br/>
+      </w:r>
+      <w:r>
+        <w:rPr>
+          <w:rFonts w:ascii="Courier New" w:eastAsia="Times New Roman" w:hAnsi="Courier New" w:cs="Courier New"/>
+          <w:sz w:val="20"/>
+          <w:szCs w:val="20"/>
+          <w:lang w:eastAsia="es-419"/>
+        </w:rPr>
+        <w:br/>
+      </w:r>
+      <w:proofErr w:type="spellStart"/>
+      <w:r>
+        <w:rPr>
+          <w:rFonts w:ascii="Courier New" w:eastAsia="Times New Roman" w:hAnsi="Courier New" w:cs="Courier New"/>
+          <w:sz w:val="20"/>
+          <w:szCs w:val="20"/>
+          <w:lang w:eastAsia="es-419"/>
+        </w:rPr>
+        <w:t>pages</w:t>
+      </w:r>
+      <w:proofErr w:type="spellEnd"/>
+      <w:r>
+        <w:rPr>
+          <w:rFonts w:ascii="Courier New" w:eastAsia="Times New Roman" w:hAnsi="Courier New" w:cs="Courier New"/>
+          <w:sz w:val="20"/>
+          <w:szCs w:val="20"/>
+          <w:lang w:eastAsia="es-419"/>
+        </w:rPr>
+        <w:t>/</w:t>
+      </w:r>
+      <w:r>
+        <w:rPr>
+          <w:rFonts w:ascii="Courier New" w:eastAsia="Times New Roman" w:hAnsi="Courier New" w:cs="Courier New"/>
+          <w:sz w:val="20"/>
+          <w:szCs w:val="20"/>
+          <w:lang w:eastAsia="es-419"/>
+        </w:rPr>
+        <w:br/>
+        <w:t xml:space="preserve">    admin/posts.py</w:t>
+      </w:r>
+      <w:r>
+        <w:rPr>
+          <w:rFonts w:ascii="Courier New" w:eastAsia="Times New Roman" w:hAnsi="Courier New" w:cs="Courier New"/>
+          <w:sz w:val="20"/>
+          <w:szCs w:val="20"/>
+          <w:lang w:eastAsia="es-419"/>
+        </w:rPr>
+        <w:br/>
+      </w:r>
+      <w:r>
+        <w:rPr>
+          <w:rFonts w:ascii="Courier New" w:eastAsia="Times New Roman" w:hAnsi="Courier New" w:cs="Courier New"/>
+          <w:sz w:val="20"/>
+          <w:szCs w:val="20"/>
+          <w:lang w:eastAsia="es-419"/>
+        </w:rPr>
+        <w:lastRenderedPageBreak/>
+        <w:t xml:space="preserve">    public/articulos.py</w:t>
+      </w:r>
+      <w:r>
+        <w:rPr>
+          <w:rFonts w:ascii="Courier New" w:eastAsia="Times New Roman" w:hAnsi="Courier New" w:cs="Courier New"/>
+          <w:sz w:val="20"/>
+          <w:szCs w:val="20"/>
+          <w:lang w:eastAsia="es-419"/>
+        </w:rPr>
+        <w:br/>
+        <w:t xml:space="preserve">    public/articulo.py</w:t>
+      </w:r>
+    </w:p>
+    <w:p>
+      <w:pPr>
+        <w:spacing w:before="100" w:beforeAutospacing="1" w:after="100" w:afterAutospacing="1" w:line="240" w:lineRule="auto"/>
+        <w:rPr>
+          <w:rFonts w:ascii="Times New Roman" w:eastAsia="Times New Roman" w:hAnsi="Times New Roman" w:cs="Times New Roman"/>
+          <w:sz w:val="24"/>
+          <w:szCs w:val="24"/>
+          <w:lang w:eastAsia="es-419"/>
+        </w:rPr>
+      </w:pPr>
+      <w:r>
+        <w:rPr>
+          <w:rFonts w:ascii="Times New Roman" w:eastAsia="Times New Roman" w:hAnsi="Times New Roman" w:cs="Times New Roman"/>
+          <w:sz w:val="24"/>
+          <w:szCs w:val="24"/>
+          <w:lang w:eastAsia="es-419"/>
+        </w:rPr>
+        <w:t>Y todo está conectado correctamente.</w:t>
+      </w:r>
+    </w:p>
+    <w:p>
+      <w:pPr>
+        <w:spacing w:before="100" w:beforeAutospacing="1" w:after="100" w:afterAutospacing="1" w:line="240" w:lineRule="auto"/>
+        <w:rPr>
+          <w:rFonts w:ascii="Times New Roman" w:eastAsia="Times New Roman" w:hAnsi="Times New Roman" w:cs="Times New Roman"/>
+          <w:sz w:val="24"/>
+          <w:szCs w:val="24"/>
+          <w:lang w:eastAsia="es-419"/>
+        </w:rPr>
+      </w:pPr>
+      <w:r>
+        <w:rPr>
+          <w:rFonts w:ascii="Times New Roman" w:eastAsia="Times New Roman" w:hAnsi="Times New Roman" w:cs="Times New Roman"/>
+          <w:sz w:val="24"/>
+          <w:szCs w:val="24"/>
+          <w:lang w:eastAsia="es-419"/>
+        </w:rPr>
+        <w:t>Eso es arquitectura limpia.</w:t>
+      </w:r>
+    </w:p>
+    <w:p>
+      <w:pPr>
+        <w:spacing w:after="0" w:line="240" w:lineRule="auto"/>
+        <w:rPr>
+          <w:rFonts w:ascii="Times New Roman" w:eastAsia="Times New Roman" w:hAnsi="Times New Roman" w:cs="Times New Roman"/>
+          <w:sz w:val="24"/>
+          <w:szCs w:val="24"/>
+          <w:lang w:eastAsia="es-419"/>
+        </w:rPr>
+      </w:pPr>
+      <w:r>
+        <w:rPr>
+          <w:rFonts w:ascii="Times New Roman" w:eastAsia="Times New Roman" w:hAnsi="Times New Roman" w:cs="Times New Roman"/>
+          <w:sz w:val="24"/>
+          <w:szCs w:val="24"/>
+          <w:lang w:eastAsia="es-419"/>
+        </w:rPr>
+        <w:pict>
+          <v:rect id="_x0000_i1088" style="width:0;height:1.5pt" o:hralign="center" o:hrstd="t" o:hr="t" fillcolor="#a0a0a0" stroked="f"/>
+        </w:pict>
+      </w:r>
+    </w:p>
+    <w:p>
+      <w:pPr>
+        <w:spacing w:before="100" w:beforeAutospacing="1" w:after="100" w:afterAutospacing="1" w:line="240" w:lineRule="auto"/>
+        <w:outlineLvl w:val="0"/>
+        <w:rPr>
+          <w:rFonts w:ascii="Times New Roman" w:eastAsia="Times New Roman" w:hAnsi="Times New Roman" w:cs="Times New Roman"/>
+          <w:b/>
+          <w:bCs/>
+          <w:kern w:val="36"/>
+          <w:sz w:val="48"/>
+          <w:szCs w:val="48"/>
+          <w:lang w:eastAsia="es-419"/>
+        </w:rPr>
+      </w:pPr>
+      <w:r>
+        <w:rPr>
+          <w:rFonts w:ascii="Segoe UI Symbol" w:eastAsia="Times New Roman" w:hAnsi="Segoe UI Symbol" w:cs="Segoe UI Symbol"/>
+          <w:b/>
+          <w:bCs/>
+          <w:kern w:val="36"/>
+          <w:sz w:val="48"/>
+          <w:szCs w:val="48"/>
+          <w:lang w:eastAsia="es-419"/>
+        </w:rPr>
+        <w:t>📈</w:t>
+      </w:r>
+      <w:r>
+        <w:rPr>
+          <w:rFonts w:ascii="Times New Roman" w:eastAsia="Times New Roman" w:hAnsi="Times New Roman" w:cs="Times New Roman"/>
+          <w:b/>
+          <w:bCs/>
+          <w:kern w:val="36"/>
+          <w:sz w:val="48"/>
+          <w:szCs w:val="48"/>
+          <w:lang w:eastAsia="es-419"/>
+        </w:rPr>
+        <w:t xml:space="preserve"> Nivel actual del proyecto</w:t>
+      </w:r>
+    </w:p>
+    <w:p>
+      <w:pPr>
+        <w:spacing w:before="100" w:beforeAutospacing="1" w:after="100" w:afterAutospacing="1" w:line="240" w:lineRule="auto"/>
+        <w:rPr>
+          <w:rFonts w:ascii="Times New Roman" w:eastAsia="Times New Roman" w:hAnsi="Times New Roman" w:cs="Times New Roman"/>
+          <w:sz w:val="24"/>
+          <w:szCs w:val="24"/>
+          <w:lang w:eastAsia="es-419"/>
+        </w:rPr>
+      </w:pPr>
+      <w:r>
+        <w:rPr>
+          <w:rFonts w:ascii="Times New Roman" w:eastAsia="Times New Roman" w:hAnsi="Times New Roman" w:cs="Times New Roman"/>
+          <w:sz w:val="24"/>
+          <w:szCs w:val="24"/>
+          <w:lang w:eastAsia="es-419"/>
+        </w:rPr>
+        <w:t>Tu CMS ya tiene:</w:t>
+      </w:r>
+    </w:p>
+    <w:p>
+      <w:pPr>
+        <w:numPr>
+          <w:ilvl w:val="0"/>
+          <w:numId w:val="29"/>
+        </w:numPr>
+        <w:spacing w:before="100" w:beforeAutospacing="1" w:after="100" w:afterAutospacing="1" w:line="240" w:lineRule="auto"/>
+        <w:rPr>
+          <w:rFonts w:ascii="Times New Roman" w:eastAsia="Times New Roman" w:hAnsi="Times New Roman" w:cs="Times New Roman"/>
+          <w:sz w:val="24"/>
+          <w:szCs w:val="24"/>
+          <w:lang w:eastAsia="es-419"/>
+        </w:rPr>
+      </w:pPr>
+      <w:proofErr w:type="spellStart"/>
+      <w:r>
+        <w:rPr>
+          <w:rFonts w:ascii="Times New Roman" w:eastAsia="Times New Roman" w:hAnsi="Times New Roman" w:cs="Times New Roman"/>
+          <w:sz w:val="24"/>
+          <w:szCs w:val="24"/>
+          <w:lang w:eastAsia="es-419"/>
+        </w:rPr>
+        <w:t>Backend</w:t>
+      </w:r>
+      <w:proofErr w:type="spellEnd"/>
+      <w:r>
+        <w:rPr>
+          <w:rFonts w:ascii="Times New Roman" w:eastAsia="Times New Roman" w:hAnsi="Times New Roman" w:cs="Times New Roman"/>
+          <w:sz w:val="24"/>
+          <w:szCs w:val="24"/>
+          <w:lang w:eastAsia="es-419"/>
+        </w:rPr>
+        <w:t xml:space="preserve"> con </w:t>
+      </w:r>
+      <w:proofErr w:type="spellStart"/>
+      <w:r>
+        <w:rPr>
+          <w:rFonts w:ascii="Times New Roman" w:eastAsia="Times New Roman" w:hAnsi="Times New Roman" w:cs="Times New Roman"/>
+          <w:sz w:val="24"/>
+          <w:szCs w:val="24"/>
+          <w:lang w:eastAsia="es-419"/>
+        </w:rPr>
+        <w:t>SQLModel</w:t>
+      </w:r>
+      <w:proofErr w:type="spellEnd"/>
+    </w:p>
+    <w:p>
+      <w:pPr>
+        <w:numPr>
+          <w:ilvl w:val="0"/>
+          <w:numId w:val="29"/>
+        </w:numPr>
+        <w:spacing w:before="100" w:beforeAutospacing="1" w:after="100" w:afterAutospacing="1" w:line="240" w:lineRule="auto"/>
+        <w:rPr>
+          <w:rFonts w:ascii="Times New Roman" w:eastAsia="Times New Roman" w:hAnsi="Times New Roman" w:cs="Times New Roman"/>
+          <w:sz w:val="24"/>
+          <w:szCs w:val="24"/>
+          <w:lang w:eastAsia="es-419"/>
+        </w:rPr>
+      </w:pPr>
+      <w:r>
+        <w:rPr>
+          <w:rFonts w:ascii="Times New Roman" w:eastAsia="Times New Roman" w:hAnsi="Times New Roman" w:cs="Times New Roman"/>
+          <w:sz w:val="24"/>
+          <w:szCs w:val="24"/>
+          <w:lang w:eastAsia="es-419"/>
+        </w:rPr>
+        <w:t>Relaciones ORM correctas</w:t>
+      </w:r>
+    </w:p>
+    <w:p>
+      <w:pPr>
+        <w:numPr>
+          <w:ilvl w:val="0"/>
+          <w:numId w:val="29"/>
+        </w:numPr>
+        <w:spacing w:before="100" w:beforeAutospacing="1" w:after="100" w:afterAutospacing="1" w:line="240" w:lineRule="auto"/>
+        <w:rPr>
+          <w:rFonts w:ascii="Times New Roman" w:eastAsia="Times New Roman" w:hAnsi="Times New Roman" w:cs="Times New Roman"/>
+          <w:sz w:val="24"/>
+          <w:szCs w:val="24"/>
+          <w:lang w:eastAsia="es-419"/>
+        </w:rPr>
+      </w:pPr>
+      <w:proofErr w:type="spellStart"/>
+      <w:r>
+        <w:rPr>
+          <w:rFonts w:ascii="Times New Roman" w:eastAsia="Times New Roman" w:hAnsi="Times New Roman" w:cs="Times New Roman"/>
+          <w:sz w:val="24"/>
+          <w:szCs w:val="24"/>
+          <w:lang w:eastAsia="es-419"/>
+        </w:rPr>
+        <w:t>Slugs</w:t>
+      </w:r>
+      <w:proofErr w:type="spellEnd"/>
+      <w:r>
+        <w:rPr>
+          <w:rFonts w:ascii="Times New Roman" w:eastAsia="Times New Roman" w:hAnsi="Times New Roman" w:cs="Times New Roman"/>
+          <w:sz w:val="24"/>
+          <w:szCs w:val="24"/>
+          <w:lang w:eastAsia="es-419"/>
+        </w:rPr>
+        <w:t xml:space="preserve"> amigables</w:t>
+      </w:r>
+    </w:p>
+    <w:p>
+      <w:pPr>
+        <w:numPr>
+          <w:ilvl w:val="0"/>
+          <w:numId w:val="29"/>
+        </w:numPr>
+        <w:spacing w:before="100" w:beforeAutospacing="1" w:after="100" w:afterAutospacing="1" w:line="240" w:lineRule="auto"/>
+        <w:rPr>
+          <w:rFonts w:ascii="Times New Roman" w:eastAsia="Times New Roman" w:hAnsi="Times New Roman" w:cs="Times New Roman"/>
+          <w:sz w:val="24"/>
+          <w:szCs w:val="24"/>
+          <w:lang w:eastAsia="es-419"/>
+        </w:rPr>
+      </w:pPr>
+      <w:proofErr w:type="spellStart"/>
+      <w:r>
+        <w:rPr>
+          <w:rFonts w:ascii="Times New Roman" w:eastAsia="Times New Roman" w:hAnsi="Times New Roman" w:cs="Times New Roman"/>
+          <w:sz w:val="24"/>
+          <w:szCs w:val="24"/>
+          <w:lang w:eastAsia="es-419"/>
+        </w:rPr>
+        <w:t>Render</w:t>
+      </w:r>
+      <w:proofErr w:type="spellEnd"/>
+      <w:r>
+        <w:rPr>
+          <w:rFonts w:ascii="Times New Roman" w:eastAsia="Times New Roman" w:hAnsi="Times New Roman" w:cs="Times New Roman"/>
+          <w:sz w:val="24"/>
+          <w:szCs w:val="24"/>
+          <w:lang w:eastAsia="es-419"/>
+        </w:rPr>
+        <w:t xml:space="preserve"> dinámico</w:t>
+      </w:r>
+    </w:p>
+    <w:p>
+      <w:pPr>
+        <w:numPr>
+          <w:ilvl w:val="0"/>
+          <w:numId w:val="29"/>
+        </w:numPr>
+        <w:spacing w:before="100" w:beforeAutospacing="1" w:after="100" w:afterAutospacing="1" w:line="240" w:lineRule="auto"/>
+        <w:rPr>
+          <w:rFonts w:ascii="Times New Roman" w:eastAsia="Times New Roman" w:hAnsi="Times New Roman" w:cs="Times New Roman"/>
+          <w:sz w:val="24"/>
+          <w:szCs w:val="24"/>
+          <w:lang w:eastAsia="es-419"/>
+        </w:rPr>
+      </w:pPr>
+      <w:r>
+        <w:rPr>
+          <w:rFonts w:ascii="Times New Roman" w:eastAsia="Times New Roman" w:hAnsi="Times New Roman" w:cs="Times New Roman"/>
+          <w:sz w:val="24"/>
+          <w:szCs w:val="24"/>
+          <w:lang w:eastAsia="es-419"/>
+        </w:rPr>
+        <w:t>Administración con categorías</w:t>
+      </w:r>
+    </w:p>
+    <w:p>
+      <w:pPr>
+        <w:numPr>
+          <w:ilvl w:val="0"/>
+          <w:numId w:val="29"/>
+        </w:numPr>
+        <w:spacing w:before="100" w:beforeAutospacing="1" w:after="100" w:afterAutospacing="1" w:line="240" w:lineRule="auto"/>
+        <w:rPr>
+          <w:rFonts w:ascii="Times New Roman" w:eastAsia="Times New Roman" w:hAnsi="Times New Roman" w:cs="Times New Roman"/>
+          <w:sz w:val="24"/>
+          <w:szCs w:val="24"/>
+          <w:lang w:eastAsia="es-419"/>
+        </w:rPr>
+      </w:pPr>
+      <w:r>
+        <w:rPr>
+          <w:rFonts w:ascii="Times New Roman" w:eastAsia="Times New Roman" w:hAnsi="Times New Roman" w:cs="Times New Roman"/>
+          <w:sz w:val="24"/>
+          <w:szCs w:val="24"/>
+          <w:lang w:eastAsia="es-419"/>
+        </w:rPr>
+        <w:t xml:space="preserve">Rutas dinámicas </w:t>
+      </w:r>
+      <w:r>
+        <w:rPr>
+          <w:rFonts w:ascii="Courier New" w:eastAsia="Times New Roman" w:hAnsi="Courier New" w:cs="Courier New"/>
+          <w:sz w:val="20"/>
+          <w:szCs w:val="20"/>
+          <w:lang w:eastAsia="es-419"/>
+        </w:rPr>
+        <w:t>/articulo/[</w:t>
+      </w:r>
+      <w:proofErr w:type="spellStart"/>
+      <w:r>
+        <w:rPr>
+          <w:rFonts w:ascii="Courier New" w:eastAsia="Times New Roman" w:hAnsi="Courier New" w:cs="Courier New"/>
+          <w:sz w:val="20"/>
+          <w:szCs w:val="20"/>
+          <w:lang w:eastAsia="es-419"/>
+        </w:rPr>
+        <w:t>slug</w:t>
+      </w:r>
+      <w:proofErr w:type="spellEnd"/>
+      <w:r>
+        <w:rPr>
+          <w:rFonts w:ascii="Courier New" w:eastAsia="Times New Roman" w:hAnsi="Courier New" w:cs="Courier New"/>
+          <w:sz w:val="20"/>
+          <w:szCs w:val="20"/>
+          <w:lang w:eastAsia="es-419"/>
+        </w:rPr>
+        <w:t>]</w:t>
+      </w:r>
+    </w:p>
+    <w:p>
+      <w:pPr>
+        <w:spacing w:before="100" w:beforeAutospacing="1" w:after="100" w:afterAutospacing="1" w:line="240" w:lineRule="auto"/>
+        <w:rPr>
+          <w:rFonts w:ascii="Times New Roman" w:eastAsia="Times New Roman" w:hAnsi="Times New Roman" w:cs="Times New Roman"/>
+          <w:sz w:val="24"/>
+          <w:szCs w:val="24"/>
+          <w:lang w:eastAsia="es-419"/>
+        </w:rPr>
+      </w:pPr>
+      <w:r>
+        <w:rPr>
+          <w:rFonts w:ascii="Times New Roman" w:eastAsia="Times New Roman" w:hAnsi="Times New Roman" w:cs="Times New Roman"/>
+          <w:sz w:val="24"/>
+          <w:szCs w:val="24"/>
+          <w:lang w:eastAsia="es-419"/>
+        </w:rPr>
+        <w:t xml:space="preserve">Esto ya es </w:t>
+      </w:r>
+      <w:proofErr w:type="spellStart"/>
+      <w:r>
+        <w:rPr>
+          <w:rFonts w:ascii="Times New Roman" w:eastAsia="Times New Roman" w:hAnsi="Times New Roman" w:cs="Times New Roman"/>
+          <w:sz w:val="24"/>
+          <w:szCs w:val="24"/>
+          <w:lang w:eastAsia="es-419"/>
+        </w:rPr>
+        <w:t>multi</w:t>
+      </w:r>
+      <w:proofErr w:type="spellEnd"/>
+      <w:r>
+        <w:rPr>
+          <w:rFonts w:ascii="Times New Roman" w:eastAsia="Times New Roman" w:hAnsi="Times New Roman" w:cs="Times New Roman"/>
+          <w:sz w:val="24"/>
+          <w:szCs w:val="24"/>
+          <w:lang w:eastAsia="es-419"/>
+        </w:rPr>
+        <w:t>-contenido estructurado.</w:t>
+      </w:r>
+    </w:p>
+    <w:p>
+      <w:pPr>
+        <w:spacing w:after="0" w:line="240" w:lineRule="auto"/>
+        <w:rPr>
+          <w:rFonts w:ascii="Times New Roman" w:eastAsia="Times New Roman" w:hAnsi="Times New Roman" w:cs="Times New Roman"/>
+          <w:sz w:val="24"/>
+          <w:szCs w:val="24"/>
+          <w:lang w:eastAsia="es-419"/>
+        </w:rPr>
+      </w:pPr>
+      <w:r>
+        <w:rPr>
+          <w:rFonts w:ascii="Times New Roman" w:eastAsia="Times New Roman" w:hAnsi="Times New Roman" w:cs="Times New Roman"/>
+          <w:sz w:val="24"/>
+          <w:szCs w:val="24"/>
+          <w:lang w:eastAsia="es-419"/>
+        </w:rPr>
+        <w:pict>
+          <v:rect id="_x0000_i1089" style="width:0;height:1.5pt" o:hralign="center" o:hrstd="t" o:hr="t" fillcolor="#a0a0a0" stroked="f"/>
+        </w:pict>
+      </w:r>
+    </w:p>
+    <w:p>
+      <w:pPr>
+        <w:spacing w:before="100" w:beforeAutospacing="1" w:after="100" w:afterAutospacing="1" w:line="240" w:lineRule="auto"/>
+        <w:outlineLvl w:val="0"/>
+        <w:rPr>
+          <w:rFonts w:ascii="Times New Roman" w:eastAsia="Times New Roman" w:hAnsi="Times New Roman" w:cs="Times New Roman"/>
+          <w:b/>
+          <w:bCs/>
+          <w:kern w:val="36"/>
+          <w:sz w:val="48"/>
+          <w:szCs w:val="48"/>
+          <w:lang w:eastAsia="es-419"/>
+        </w:rPr>
+      </w:pPr>
+      <w:r>
+        <w:rPr>
+          <w:rFonts w:ascii="Segoe UI Symbol" w:eastAsia="Times New Roman" w:hAnsi="Segoe UI Symbol" w:cs="Segoe UI Symbol"/>
+          <w:b/>
+          <w:bCs/>
+          <w:kern w:val="36"/>
+          <w:sz w:val="48"/>
+          <w:szCs w:val="48"/>
+          <w:lang w:eastAsia="es-419"/>
+        </w:rPr>
+        <w:t>🚀</w:t>
+      </w:r>
+      <w:r>
+        <w:rPr>
+          <w:rFonts w:ascii="Times New Roman" w:eastAsia="Times New Roman" w:hAnsi="Times New Roman" w:cs="Times New Roman"/>
+          <w:b/>
+          <w:bCs/>
+          <w:kern w:val="36"/>
+          <w:sz w:val="48"/>
+          <w:szCs w:val="48"/>
+          <w:lang w:eastAsia="es-419"/>
+        </w:rPr>
+        <w:t xml:space="preserve"> Siguiente Paso Estratégico</w:t>
+      </w:r>
+    </w:p>
+    <w:p>
+      <w:pPr>
+        <w:spacing w:before="100" w:beforeAutospacing="1" w:after="100" w:afterAutospacing="1" w:line="240" w:lineRule="auto"/>
+        <w:rPr>
+          <w:rFonts w:ascii="Times New Roman" w:eastAsia="Times New Roman" w:hAnsi="Times New Roman" w:cs="Times New Roman"/>
+          <w:sz w:val="24"/>
+          <w:szCs w:val="24"/>
+          <w:lang w:eastAsia="es-419"/>
+        </w:rPr>
+      </w:pPr>
+      <w:r>
+        <w:rPr>
+          <w:rFonts w:ascii="Times New Roman" w:eastAsia="Times New Roman" w:hAnsi="Times New Roman" w:cs="Times New Roman"/>
+          <w:sz w:val="24"/>
+          <w:szCs w:val="24"/>
+          <w:lang w:eastAsia="es-419"/>
+        </w:rPr>
+        <w:t>Ahora entramos en parte realmente interesante.</w:t>
+      </w:r>
+    </w:p>
+    <w:p>
+      <w:pPr>
+        <w:spacing w:before="100" w:beforeAutospacing="1" w:after="100" w:afterAutospacing="1" w:line="240" w:lineRule="auto"/>
+        <w:rPr>
+          <w:rFonts w:ascii="Times New Roman" w:eastAsia="Times New Roman" w:hAnsi="Times New Roman" w:cs="Times New Roman"/>
+          <w:sz w:val="24"/>
+          <w:szCs w:val="24"/>
+          <w:lang w:eastAsia="es-419"/>
+        </w:rPr>
+      </w:pPr>
+      <w:r>
+        <w:rPr>
+          <w:rFonts w:ascii="Times New Roman" w:eastAsia="Times New Roman" w:hAnsi="Times New Roman" w:cs="Times New Roman"/>
+          <w:sz w:val="24"/>
+          <w:szCs w:val="24"/>
+          <w:lang w:eastAsia="es-419"/>
+        </w:rPr>
+        <w:t>Te propongo este orden profesional:</w:t>
+      </w:r>
+    </w:p>
+    <w:p>
+      <w:pPr>
+        <w:spacing w:before="100" w:beforeAutospacing="1" w:after="100" w:afterAutospacing="1" w:line="240" w:lineRule="auto"/>
+        <w:outlineLvl w:val="1"/>
+        <w:rPr>
+          <w:rFonts w:ascii="Times New Roman" w:eastAsia="Times New Roman" w:hAnsi="Times New Roman" w:cs="Times New Roman"/>
+          <w:b/>
+          <w:bCs/>
+          <w:sz w:val="36"/>
+          <w:szCs w:val="36"/>
+          <w:lang w:eastAsia="es-419"/>
+        </w:rPr>
+      </w:pPr>
+      <w:r>
+        <w:rPr>
+          <w:rFonts w:ascii="Times New Roman" w:eastAsia="Times New Roman" w:hAnsi="Times New Roman" w:cs="Times New Roman"/>
+          <w:b/>
+          <w:bCs/>
+          <w:sz w:val="36"/>
+          <w:szCs w:val="36"/>
+          <w:lang w:eastAsia="es-419"/>
+        </w:rPr>
+        <w:t>1️</w:t>
+      </w:r>
+      <w:r>
+        <w:rPr>
+          <w:rFonts w:ascii="Tahoma" w:eastAsia="Times New Roman" w:hAnsi="Tahoma" w:cs="Tahoma"/>
+          <w:b/>
+          <w:bCs/>
+          <w:sz w:val="36"/>
+          <w:szCs w:val="36"/>
+          <w:lang w:eastAsia="es-419"/>
+        </w:rPr>
+        <w:t>⃣</w:t>
+      </w:r>
+      <w:r>
+        <w:rPr>
+          <w:rFonts w:ascii="Times New Roman" w:eastAsia="Times New Roman" w:hAnsi="Times New Roman" w:cs="Times New Roman"/>
+          <w:b/>
+          <w:bCs/>
+          <w:sz w:val="36"/>
+          <w:szCs w:val="36"/>
+          <w:lang w:eastAsia="es-419"/>
+        </w:rPr>
+        <w:t xml:space="preserve"> Mostrar categoría en vista pública</w:t>
+      </w:r>
+    </w:p>
+    <w:p>
+      <w:pPr>
+        <w:spacing w:before="100" w:beforeAutospacing="1" w:after="100" w:afterAutospacing="1" w:line="240" w:lineRule="auto"/>
+        <w:rPr>
+          <w:rFonts w:ascii="Times New Roman" w:eastAsia="Times New Roman" w:hAnsi="Times New Roman" w:cs="Times New Roman"/>
+          <w:sz w:val="24"/>
+          <w:szCs w:val="24"/>
+          <w:lang w:eastAsia="es-419"/>
+        </w:rPr>
+      </w:pPr>
+      <w:r>
+        <w:rPr>
+          <w:rFonts w:ascii="Times New Roman" w:eastAsia="Times New Roman" w:hAnsi="Times New Roman" w:cs="Times New Roman"/>
+          <w:sz w:val="24"/>
+          <w:szCs w:val="24"/>
+          <w:lang w:eastAsia="es-419"/>
+        </w:rPr>
+        <w:t>Que el artículo muestre:</w:t>
+      </w:r>
+    </w:p>
+    <w:p>
+      <w:pPr>
+        <w:tabs>
+          <w:tab w:val="left" w:pos="916"/>
+          <w:tab w:val="left" w:pos="1832"/>
+          <w:tab w:val="left" w:pos="2748"/>
+          <w:tab w:val="left" w:pos="3664"/>
+          <w:tab w:val="left" w:pos="4580"/>
+          <w:tab w:val="left" w:pos="5496"/>
+          <w:tab w:val="left" w:pos="6412"/>
+          <w:tab w:val="left" w:pos="7328"/>
+          <w:tab w:val="left" w:pos="8244"/>
+          <w:tab w:val="left" w:pos="9160"/>
+          <w:tab w:val="left" w:pos="10076"/>
+          <w:tab w:val="left" w:pos="10992"/>
+          <w:tab w:val="left" w:pos="11908"/>
+          <w:tab w:val="left" w:pos="12824"/>
+          <w:tab w:val="left" w:pos="13740"/>
+          <w:tab w:val="left" w:pos="14656"/>
+        </w:tabs>
+        <w:spacing w:after="0" w:line="240" w:lineRule="auto"/>
+        <w:rPr>
+          <w:rFonts w:ascii="Courier New" w:eastAsia="Times New Roman" w:hAnsi="Courier New" w:cs="Courier New"/>
+          <w:sz w:val="20"/>
+          <w:szCs w:val="20"/>
+          <w:lang w:eastAsia="es-419"/>
+        </w:rPr>
+      </w:pPr>
+      <w:r>
+        <w:rPr>
+          <w:rFonts w:ascii="Courier New" w:eastAsia="Times New Roman" w:hAnsi="Courier New" w:cs="Courier New"/>
+          <w:sz w:val="20"/>
+          <w:szCs w:val="20"/>
+          <w:lang w:eastAsia="es-419"/>
+        </w:rPr>
+        <w:t>Historia Argentina 1</w:t>
+      </w:r>
+      <w:r>
+        <w:rPr>
+          <w:rFonts w:ascii="Courier New" w:eastAsia="Times New Roman" w:hAnsi="Courier New" w:cs="Courier New"/>
+          <w:sz w:val="20"/>
+          <w:szCs w:val="20"/>
+          <w:lang w:eastAsia="es-419"/>
+        </w:rPr>
+        <w:br/>
+        <w:t>Categoría: Historia</w:t>
+      </w:r>
+    </w:p>
+    <w:p>
+      <w:pPr>
+        <w:spacing w:before="100" w:beforeAutospacing="1" w:after="100" w:afterAutospacing="1" w:line="240" w:lineRule="auto"/>
+        <w:outlineLvl w:val="1"/>
+        <w:rPr>
+          <w:rFonts w:ascii="Times New Roman" w:eastAsia="Times New Roman" w:hAnsi="Times New Roman" w:cs="Times New Roman"/>
+          <w:b/>
+          <w:bCs/>
+          <w:sz w:val="36"/>
+          <w:szCs w:val="36"/>
+          <w:lang w:eastAsia="es-419"/>
+        </w:rPr>
+      </w:pPr>
+      <w:r>
+        <w:rPr>
+          <w:rFonts w:ascii="Times New Roman" w:eastAsia="Times New Roman" w:hAnsi="Times New Roman" w:cs="Times New Roman"/>
+          <w:b/>
+          <w:bCs/>
+          <w:sz w:val="36"/>
+          <w:szCs w:val="36"/>
+          <w:lang w:eastAsia="es-419"/>
+        </w:rPr>
+        <w:t>2️</w:t>
+      </w:r>
+      <w:r>
+        <w:rPr>
+          <w:rFonts w:ascii="Tahoma" w:eastAsia="Times New Roman" w:hAnsi="Tahoma" w:cs="Tahoma"/>
+          <w:b/>
+          <w:bCs/>
+          <w:sz w:val="36"/>
+          <w:szCs w:val="36"/>
+          <w:lang w:eastAsia="es-419"/>
+        </w:rPr>
+        <w:t>⃣</w:t>
+      </w:r>
+      <w:r>
+        <w:rPr>
+          <w:rFonts w:ascii="Times New Roman" w:eastAsia="Times New Roman" w:hAnsi="Times New Roman" w:cs="Times New Roman"/>
+          <w:b/>
+          <w:bCs/>
+          <w:sz w:val="36"/>
+          <w:szCs w:val="36"/>
+          <w:lang w:eastAsia="es-419"/>
+        </w:rPr>
+        <w:t xml:space="preserve"> Filtrar artículos por categoría</w:t>
+      </w:r>
+    </w:p>
+    <w:p>
+      <w:pPr>
+        <w:spacing w:before="100" w:beforeAutospacing="1" w:after="100" w:afterAutospacing="1" w:line="240" w:lineRule="auto"/>
+        <w:rPr>
+          <w:rFonts w:ascii="Times New Roman" w:eastAsia="Times New Roman" w:hAnsi="Times New Roman" w:cs="Times New Roman"/>
+          <w:sz w:val="24"/>
+          <w:szCs w:val="24"/>
+          <w:lang w:eastAsia="es-419"/>
+        </w:rPr>
+      </w:pPr>
+      <w:r>
+        <w:rPr>
+          <w:rFonts w:ascii="Times New Roman" w:eastAsia="Times New Roman" w:hAnsi="Times New Roman" w:cs="Times New Roman"/>
+          <w:sz w:val="24"/>
+          <w:szCs w:val="24"/>
+          <w:lang w:eastAsia="es-419"/>
+        </w:rPr>
+        <w:t>Ejemplo:</w:t>
+      </w:r>
+    </w:p>
+    <w:p>
+      <w:pPr>
+        <w:tabs>
+          <w:tab w:val="left" w:pos="916"/>
+          <w:tab w:val="left" w:pos="1832"/>
+          <w:tab w:val="left" w:pos="2748"/>
+          <w:tab w:val="left" w:pos="3664"/>
+          <w:tab w:val="left" w:pos="4580"/>
+          <w:tab w:val="left" w:pos="5496"/>
+          <w:tab w:val="left" w:pos="6412"/>
+          <w:tab w:val="left" w:pos="7328"/>
+          <w:tab w:val="left" w:pos="8244"/>
+          <w:tab w:val="left" w:pos="9160"/>
+          <w:tab w:val="left" w:pos="10076"/>
+          <w:tab w:val="left" w:pos="10992"/>
+          <w:tab w:val="left" w:pos="11908"/>
+          <w:tab w:val="left" w:pos="12824"/>
+          <w:tab w:val="left" w:pos="13740"/>
+          <w:tab w:val="left" w:pos="14656"/>
+        </w:tabs>
+        <w:spacing w:after="0" w:line="240" w:lineRule="auto"/>
+        <w:rPr>
+          <w:rFonts w:ascii="Courier New" w:eastAsia="Times New Roman" w:hAnsi="Courier New" w:cs="Courier New"/>
+          <w:sz w:val="20"/>
+          <w:szCs w:val="20"/>
+          <w:lang w:eastAsia="es-419"/>
+        </w:rPr>
+      </w:pPr>
+      <w:r>
+        <w:rPr>
+          <w:rFonts w:ascii="Courier New" w:eastAsia="Times New Roman" w:hAnsi="Courier New" w:cs="Courier New"/>
+          <w:sz w:val="20"/>
+          <w:szCs w:val="20"/>
+          <w:lang w:eastAsia="es-419"/>
+        </w:rPr>
+        <w:t>/</w:t>
+      </w:r>
+      <w:proofErr w:type="spellStart"/>
+      <w:r>
+        <w:rPr>
+          <w:rFonts w:ascii="Courier New" w:eastAsia="Times New Roman" w:hAnsi="Courier New" w:cs="Courier New"/>
+          <w:sz w:val="20"/>
+          <w:szCs w:val="20"/>
+          <w:lang w:eastAsia="es-419"/>
+        </w:rPr>
+        <w:t>categoria</w:t>
+      </w:r>
+      <w:proofErr w:type="spellEnd"/>
+      <w:r>
+        <w:rPr>
+          <w:rFonts w:ascii="Courier New" w:eastAsia="Times New Roman" w:hAnsi="Courier New" w:cs="Courier New"/>
+          <w:sz w:val="20"/>
+          <w:szCs w:val="20"/>
+          <w:lang w:eastAsia="es-419"/>
+        </w:rPr>
+        <w:t>/historia</w:t>
+      </w:r>
+    </w:p>
+    <w:p>
+      <w:pPr>
+        <w:spacing w:before="100" w:beforeAutospacing="1" w:after="100" w:afterAutospacing="1" w:line="240" w:lineRule="auto"/>
+        <w:outlineLvl w:val="1"/>
+        <w:rPr>
+          <w:rFonts w:ascii="Times New Roman" w:eastAsia="Times New Roman" w:hAnsi="Times New Roman" w:cs="Times New Roman"/>
+          <w:b/>
+          <w:bCs/>
+          <w:sz w:val="36"/>
+          <w:szCs w:val="36"/>
+          <w:lang w:eastAsia="es-419"/>
+        </w:rPr>
+      </w:pPr>
+      <w:r>
+        <w:rPr>
+          <w:rFonts w:ascii="Times New Roman" w:eastAsia="Times New Roman" w:hAnsi="Times New Roman" w:cs="Times New Roman"/>
+          <w:b/>
+          <w:bCs/>
+          <w:sz w:val="36"/>
+          <w:szCs w:val="36"/>
+          <w:lang w:eastAsia="es-419"/>
+        </w:rPr>
+        <w:t>3️</w:t>
+      </w:r>
+      <w:r>
+        <w:rPr>
+          <w:rFonts w:ascii="Tahoma" w:eastAsia="Times New Roman" w:hAnsi="Tahoma" w:cs="Tahoma"/>
+          <w:b/>
+          <w:bCs/>
+          <w:sz w:val="36"/>
+          <w:szCs w:val="36"/>
+          <w:lang w:eastAsia="es-419"/>
+        </w:rPr>
+        <w:t>⃣</w:t>
+      </w:r>
+      <w:r>
+        <w:rPr>
+          <w:rFonts w:ascii="Times New Roman" w:eastAsia="Times New Roman" w:hAnsi="Times New Roman" w:cs="Times New Roman"/>
+          <w:b/>
+          <w:bCs/>
+          <w:sz w:val="36"/>
+          <w:szCs w:val="36"/>
+          <w:lang w:eastAsia="es-419"/>
+        </w:rPr>
+        <w:t xml:space="preserve"> Agregar SEO real</w:t>
+      </w:r>
+    </w:p>
+    <w:p>
+      <w:pPr>
+        <w:numPr>
+          <w:ilvl w:val="0"/>
+          <w:numId w:val="30"/>
+        </w:numPr>
+        <w:spacing w:before="100" w:beforeAutospacing="1" w:after="100" w:afterAutospacing="1" w:line="240" w:lineRule="auto"/>
+        <w:rPr>
+          <w:rFonts w:ascii="Times New Roman" w:eastAsia="Times New Roman" w:hAnsi="Times New Roman" w:cs="Times New Roman"/>
+          <w:sz w:val="24"/>
+          <w:szCs w:val="24"/>
+          <w:lang w:eastAsia="es-419"/>
+        </w:rPr>
+      </w:pPr>
+      <w:proofErr w:type="spellStart"/>
+      <w:r>
+        <w:rPr>
+          <w:rFonts w:ascii="Times New Roman" w:eastAsia="Times New Roman" w:hAnsi="Times New Roman" w:cs="Times New Roman"/>
+          <w:sz w:val="24"/>
+          <w:szCs w:val="24"/>
+          <w:lang w:eastAsia="es-419"/>
+        </w:rPr>
+        <w:t>title</w:t>
+      </w:r>
+      <w:proofErr w:type="spellEnd"/>
+      <w:r>
+        <w:rPr>
+          <w:rFonts w:ascii="Times New Roman" w:eastAsia="Times New Roman" w:hAnsi="Times New Roman" w:cs="Times New Roman"/>
+          <w:sz w:val="24"/>
+          <w:szCs w:val="24"/>
+          <w:lang w:eastAsia="es-419"/>
+        </w:rPr>
+        <w:t xml:space="preserve"> dinámico</w:t>
+      </w:r>
+    </w:p>
+    <w:p>
+      <w:pPr>
+        <w:numPr>
+          <w:ilvl w:val="0"/>
+          <w:numId w:val="30"/>
+        </w:numPr>
+        <w:spacing w:before="100" w:beforeAutospacing="1" w:after="100" w:afterAutospacing="1" w:line="240" w:lineRule="auto"/>
+        <w:rPr>
+          <w:rFonts w:ascii="Times New Roman" w:eastAsia="Times New Roman" w:hAnsi="Times New Roman" w:cs="Times New Roman"/>
+          <w:sz w:val="24"/>
+          <w:szCs w:val="24"/>
+          <w:lang w:eastAsia="es-419"/>
+        </w:rPr>
+      </w:pPr>
+      <w:r>
+        <w:rPr>
+          <w:rFonts w:ascii="Times New Roman" w:eastAsia="Times New Roman" w:hAnsi="Times New Roman" w:cs="Times New Roman"/>
+          <w:sz w:val="24"/>
+          <w:szCs w:val="24"/>
+          <w:lang w:eastAsia="es-419"/>
+        </w:rPr>
+        <w:lastRenderedPageBreak/>
+        <w:t xml:space="preserve">meta </w:t>
+      </w:r>
+      <w:proofErr w:type="spellStart"/>
+      <w:r>
+        <w:rPr>
+          <w:rFonts w:ascii="Times New Roman" w:eastAsia="Times New Roman" w:hAnsi="Times New Roman" w:cs="Times New Roman"/>
+          <w:sz w:val="24"/>
+          <w:szCs w:val="24"/>
+          <w:lang w:eastAsia="es-419"/>
+        </w:rPr>
+        <w:t>description</w:t>
+      </w:r>
+      <w:proofErr w:type="spellEnd"/>
+    </w:p>
+    <w:p>
+      <w:pPr>
+        <w:numPr>
+          <w:ilvl w:val="0"/>
+          <w:numId w:val="30"/>
+        </w:numPr>
+        <w:spacing w:before="100" w:beforeAutospacing="1" w:after="100" w:afterAutospacing="1" w:line="240" w:lineRule="auto"/>
+        <w:rPr>
+          <w:rFonts w:ascii="Times New Roman" w:eastAsia="Times New Roman" w:hAnsi="Times New Roman" w:cs="Times New Roman"/>
+          <w:sz w:val="24"/>
+          <w:szCs w:val="24"/>
+          <w:lang w:eastAsia="es-419"/>
+        </w:rPr>
+      </w:pPr>
+      <w:r>
+        <w:rPr>
+          <w:rFonts w:ascii="Times New Roman" w:eastAsia="Times New Roman" w:hAnsi="Times New Roman" w:cs="Times New Roman"/>
+          <w:sz w:val="24"/>
+          <w:szCs w:val="24"/>
+          <w:lang w:eastAsia="es-419"/>
+        </w:rPr>
+        <w:t xml:space="preserve">meta </w:t>
+      </w:r>
+      <w:proofErr w:type="spellStart"/>
+      <w:proofErr w:type="gramStart"/>
+      <w:r>
+        <w:rPr>
+          <w:rFonts w:ascii="Times New Roman" w:eastAsia="Times New Roman" w:hAnsi="Times New Roman" w:cs="Times New Roman"/>
+          <w:sz w:val="24"/>
+          <w:szCs w:val="24"/>
+          <w:lang w:eastAsia="es-419"/>
+        </w:rPr>
+        <w:t>og:image</w:t>
+      </w:r>
+      <w:proofErr w:type="spellEnd"/>
+      <w:proofErr w:type="gramEnd"/>
+    </w:p>
+    <w:p>
+      <w:pPr>
+        <w:spacing w:before="100" w:beforeAutospacing="1" w:after="100" w:afterAutospacing="1" w:line="240" w:lineRule="auto"/>
+        <w:outlineLvl w:val="1"/>
+        <w:rPr>
+          <w:rFonts w:ascii="Times New Roman" w:eastAsia="Times New Roman" w:hAnsi="Times New Roman" w:cs="Times New Roman"/>
+          <w:b/>
+          <w:bCs/>
+          <w:sz w:val="36"/>
+          <w:szCs w:val="36"/>
+          <w:lang w:eastAsia="es-419"/>
+        </w:rPr>
+      </w:pPr>
+      <w:r>
+        <w:rPr>
+          <w:rFonts w:ascii="Times New Roman" w:eastAsia="Times New Roman" w:hAnsi="Times New Roman" w:cs="Times New Roman"/>
+          <w:b/>
+          <w:bCs/>
+          <w:sz w:val="36"/>
+          <w:szCs w:val="36"/>
+          <w:lang w:eastAsia="es-419"/>
+        </w:rPr>
+        <w:t>4️</w:t>
+      </w:r>
+      <w:r>
+        <w:rPr>
+          <w:rFonts w:ascii="Tahoma" w:eastAsia="Times New Roman" w:hAnsi="Tahoma" w:cs="Tahoma"/>
+          <w:b/>
+          <w:bCs/>
+          <w:sz w:val="36"/>
+          <w:szCs w:val="36"/>
+          <w:lang w:eastAsia="es-419"/>
+        </w:rPr>
+        <w:t>⃣</w:t>
+      </w:r>
+      <w:r>
+        <w:rPr>
+          <w:rFonts w:ascii="Times New Roman" w:eastAsia="Times New Roman" w:hAnsi="Times New Roman" w:cs="Times New Roman"/>
+          <w:b/>
+          <w:bCs/>
+          <w:sz w:val="36"/>
+          <w:szCs w:val="36"/>
+          <w:lang w:eastAsia="es-419"/>
+        </w:rPr>
+        <w:t xml:space="preserve"> Editor enriquecido (WYSIWYG)</w:t>
+      </w:r>
+    </w:p>
+    <w:p>
+      <w:pPr>
+        <w:spacing w:before="100" w:beforeAutospacing="1" w:after="100" w:afterAutospacing="1" w:line="240" w:lineRule="auto"/>
+        <w:rPr>
+          <w:rFonts w:ascii="Times New Roman" w:eastAsia="Times New Roman" w:hAnsi="Times New Roman" w:cs="Times New Roman"/>
+          <w:sz w:val="24"/>
+          <w:szCs w:val="24"/>
+          <w:lang w:eastAsia="es-419"/>
+        </w:rPr>
+      </w:pPr>
+      <w:r>
+        <w:rPr>
+          <w:rFonts w:ascii="Times New Roman" w:eastAsia="Times New Roman" w:hAnsi="Times New Roman" w:cs="Times New Roman"/>
+          <w:sz w:val="24"/>
+          <w:szCs w:val="24"/>
+          <w:lang w:eastAsia="es-419"/>
+        </w:rPr>
+        <w:t xml:space="preserve">Para que no sea solo </w:t>
+      </w:r>
+      <w:proofErr w:type="spellStart"/>
+      <w:r>
+        <w:rPr>
+          <w:rFonts w:ascii="Times New Roman" w:eastAsia="Times New Roman" w:hAnsi="Times New Roman" w:cs="Times New Roman"/>
+          <w:sz w:val="24"/>
+          <w:szCs w:val="24"/>
+          <w:lang w:eastAsia="es-419"/>
+        </w:rPr>
+        <w:t>textarea</w:t>
+      </w:r>
+      <w:proofErr w:type="spellEnd"/>
+      <w:r>
+        <w:rPr>
+          <w:rFonts w:ascii="Times New Roman" w:eastAsia="Times New Roman" w:hAnsi="Times New Roman" w:cs="Times New Roman"/>
+          <w:sz w:val="24"/>
+          <w:szCs w:val="24"/>
+          <w:lang w:eastAsia="es-419"/>
+        </w:rPr>
+        <w:t>.</w:t>
+      </w:r>
+    </w:p>
+    <w:p>
+      <w:pPr>
+        <w:spacing w:before="100" w:beforeAutospacing="1" w:after="100" w:afterAutospacing="1" w:line="240" w:lineRule="auto"/>
+        <w:outlineLvl w:val="1"/>
+        <w:rPr>
+          <w:rFonts w:ascii="Times New Roman" w:eastAsia="Times New Roman" w:hAnsi="Times New Roman" w:cs="Times New Roman"/>
+          <w:b/>
+          <w:bCs/>
+          <w:sz w:val="36"/>
+          <w:szCs w:val="36"/>
+          <w:lang w:eastAsia="es-419"/>
+        </w:rPr>
+      </w:pPr>
+      <w:r>
+        <w:rPr>
+          <w:rFonts w:ascii="Times New Roman" w:eastAsia="Times New Roman" w:hAnsi="Times New Roman" w:cs="Times New Roman"/>
+          <w:b/>
+          <w:bCs/>
+          <w:sz w:val="36"/>
+          <w:szCs w:val="36"/>
+          <w:lang w:eastAsia="es-419"/>
+        </w:rPr>
+        <w:t>5️</w:t>
+      </w:r>
+      <w:r>
+        <w:rPr>
+          <w:rFonts w:ascii="Tahoma" w:eastAsia="Times New Roman" w:hAnsi="Tahoma" w:cs="Tahoma"/>
+          <w:b/>
+          <w:bCs/>
+          <w:sz w:val="36"/>
+          <w:szCs w:val="36"/>
+          <w:lang w:eastAsia="es-419"/>
+        </w:rPr>
+        <w:t>⃣</w:t>
+      </w:r>
+      <w:r>
+        <w:rPr>
+          <w:rFonts w:ascii="Times New Roman" w:eastAsia="Times New Roman" w:hAnsi="Times New Roman" w:cs="Times New Roman"/>
+          <w:b/>
+          <w:bCs/>
+          <w:sz w:val="36"/>
+          <w:szCs w:val="36"/>
+          <w:lang w:eastAsia="es-419"/>
+        </w:rPr>
+        <w:t xml:space="preserve"> </w:t>
+      </w:r>
+      <w:proofErr w:type="spellStart"/>
+      <w:r>
+        <w:rPr>
+          <w:rFonts w:ascii="Times New Roman" w:eastAsia="Times New Roman" w:hAnsi="Times New Roman" w:cs="Times New Roman"/>
+          <w:b/>
+          <w:bCs/>
+          <w:sz w:val="36"/>
+          <w:szCs w:val="36"/>
+          <w:lang w:eastAsia="es-419"/>
+        </w:rPr>
+        <w:t>Multi</w:t>
+      </w:r>
+      <w:proofErr w:type="spellEnd"/>
+      <w:r>
+        <w:rPr>
+          <w:rFonts w:ascii="Times New Roman" w:eastAsia="Times New Roman" w:hAnsi="Times New Roman" w:cs="Times New Roman"/>
+          <w:b/>
+          <w:bCs/>
+          <w:sz w:val="36"/>
+          <w:szCs w:val="36"/>
+          <w:lang w:eastAsia="es-419"/>
+        </w:rPr>
+        <w:t>-cliente real</w:t>
+      </w:r>
+    </w:p>
+    <w:p>
+      <w:pPr>
+        <w:spacing w:before="100" w:beforeAutospacing="1" w:after="100" w:afterAutospacing="1" w:line="240" w:lineRule="auto"/>
+        <w:rPr>
+          <w:rFonts w:ascii="Times New Roman" w:eastAsia="Times New Roman" w:hAnsi="Times New Roman" w:cs="Times New Roman"/>
+          <w:sz w:val="24"/>
+          <w:szCs w:val="24"/>
+          <w:lang w:eastAsia="es-419"/>
+        </w:rPr>
+      </w:pPr>
+      <w:r>
+        <w:rPr>
+          <w:rFonts w:ascii="Times New Roman" w:eastAsia="Times New Roman" w:hAnsi="Times New Roman" w:cs="Times New Roman"/>
+          <w:sz w:val="24"/>
+          <w:szCs w:val="24"/>
+          <w:lang w:eastAsia="es-419"/>
+        </w:rPr>
+        <w:t>Separar por usuario creador.</w:t>
+      </w:r>
+    </w:p>
+    <w:p>
+      <w:pPr>
+        <w:spacing w:after="0" w:line="240" w:lineRule="auto"/>
         <w:rPr>
           <w:rFonts w:ascii="Times New Roman" w:eastAsia="Times New Roman" w:hAnsi="Times New Roman" w:cs="Times New Roman"/>
           <w:sz w:val="24"/>
@@ -21202,6 +22966,17 @@
       </w:pPr>
       <w:bookmarkStart w:id="0" w:name="_GoBack"/>
       <w:bookmarkEnd w:id="0"/>
+    </w:p>
+    <w:p>
+      <w:pPr>
+        <w:spacing w:before="100" w:beforeAutospacing="1" w:after="100" w:afterAutospacing="1" w:line="240" w:lineRule="auto"/>
+        <w:rPr>
+          <w:rFonts w:ascii="Times New Roman" w:eastAsia="Times New Roman" w:hAnsi="Times New Roman" w:cs="Times New Roman"/>
+          <w:sz w:val="24"/>
+          <w:szCs w:val="24"/>
+          <w:lang w:eastAsia="es-419"/>
+        </w:rPr>
+      </w:pPr>
     </w:p>
     <w:p>
       <w:pPr>
@@ -22200,122 +23975,9 @@
     </w:lvl>
   </w:abstractNum>
   <w:abstractNum w:abstractNumId="7" w15:restartNumberingAfterBreak="0">
-    <w:nsid w:val="243E2904"/>
+    <w:nsid w:val="20FC277A"/>
     <w:multiLevelType w:val="multilevel"/>
-    <w:tmpl w:val="630C384A"/>
-    <w:lvl w:ilvl="0">
-      <w:start w:val="3"/>
-      <w:numFmt w:val="decimal"/>
-      <w:lvlText w:val="%1."/>
-      <w:lvlJc w:val="left"/>
-      <w:pPr>
-        <w:tabs>
-          <w:tab w:val="num" w:pos="720"/>
-        </w:tabs>
-        <w:ind w:left="720" w:hanging="360"/>
-      </w:pPr>
-    </w:lvl>
-    <w:lvl w:ilvl="1" w:tentative="1">
-      <w:start w:val="1"/>
-      <w:numFmt w:val="decimal"/>
-      <w:lvlText w:val="%2."/>
-      <w:lvlJc w:val="left"/>
-      <w:pPr>
-        <w:tabs>
-          <w:tab w:val="num" w:pos="1440"/>
-        </w:tabs>
-        <w:ind w:left="1440" w:hanging="360"/>
-      </w:pPr>
-    </w:lvl>
-    <w:lvl w:ilvl="2" w:tentative="1">
-      <w:start w:val="1"/>
-      <w:numFmt w:val="decimal"/>
-      <w:lvlText w:val="%3."/>
-      <w:lvlJc w:val="left"/>
-      <w:pPr>
-        <w:tabs>
-          <w:tab w:val="num" w:pos="2160"/>
-        </w:tabs>
-        <w:ind w:left="2160" w:hanging="360"/>
-      </w:pPr>
-    </w:lvl>
-    <w:lvl w:ilvl="3" w:tentative="1">
-      <w:start w:val="1"/>
-      <w:numFmt w:val="decimal"/>
-      <w:lvlText w:val="%4."/>
-      <w:lvlJc w:val="left"/>
-      <w:pPr>
-        <w:tabs>
-          <w:tab w:val="num" w:pos="2880"/>
-        </w:tabs>
-        <w:ind w:left="2880" w:hanging="360"/>
-      </w:pPr>
-    </w:lvl>
-    <w:lvl w:ilvl="4" w:tentative="1">
-      <w:start w:val="1"/>
-      <w:numFmt w:val="decimal"/>
-      <w:lvlText w:val="%5."/>
-      <w:lvlJc w:val="left"/>
-      <w:pPr>
-        <w:tabs>
-          <w:tab w:val="num" w:pos="3600"/>
-        </w:tabs>
-        <w:ind w:left="3600" w:hanging="360"/>
-      </w:pPr>
-    </w:lvl>
-    <w:lvl w:ilvl="5" w:tentative="1">
-      <w:start w:val="1"/>
-      <w:numFmt w:val="decimal"/>
-      <w:lvlText w:val="%6."/>
-      <w:lvlJc w:val="left"/>
-      <w:pPr>
-        <w:tabs>
-          <w:tab w:val="num" w:pos="4320"/>
-        </w:tabs>
-        <w:ind w:left="4320" w:hanging="360"/>
-      </w:pPr>
-    </w:lvl>
-    <w:lvl w:ilvl="6" w:tentative="1">
-      <w:start w:val="1"/>
-      <w:numFmt w:val="decimal"/>
-      <w:lvlText w:val="%7."/>
-      <w:lvlJc w:val="left"/>
-      <w:pPr>
-        <w:tabs>
-          <w:tab w:val="num" w:pos="5040"/>
-        </w:tabs>
-        <w:ind w:left="5040" w:hanging="360"/>
-      </w:pPr>
-    </w:lvl>
-    <w:lvl w:ilvl="7" w:tentative="1">
-      <w:start w:val="1"/>
-      <w:numFmt w:val="decimal"/>
-      <w:lvlText w:val="%8."/>
-      <w:lvlJc w:val="left"/>
-      <w:pPr>
-        <w:tabs>
-          <w:tab w:val="num" w:pos="5760"/>
-        </w:tabs>
-        <w:ind w:left="5760" w:hanging="360"/>
-      </w:pPr>
-    </w:lvl>
-    <w:lvl w:ilvl="8" w:tentative="1">
-      <w:start w:val="1"/>
-      <w:numFmt w:val="decimal"/>
-      <w:lvlText w:val="%9."/>
-      <w:lvlJc w:val="left"/>
-      <w:pPr>
-        <w:tabs>
-          <w:tab w:val="num" w:pos="6480"/>
-        </w:tabs>
-        <w:ind w:left="6480" w:hanging="360"/>
-      </w:pPr>
-    </w:lvl>
-  </w:abstractNum>
-  <w:abstractNum w:abstractNumId="8" w15:restartNumberingAfterBreak="0">
-    <w:nsid w:val="24AF16C0"/>
-    <w:multiLevelType w:val="multilevel"/>
-    <w:tmpl w:val="F3BAE06E"/>
+    <w:tmpl w:val="3EF6D6FE"/>
     <w:lvl w:ilvl="0">
       <w:start w:val="1"/>
       <w:numFmt w:val="bullet"/>
@@ -22461,12 +24123,12 @@
       </w:rPr>
     </w:lvl>
   </w:abstractNum>
-  <w:abstractNum w:abstractNumId="9" w15:restartNumberingAfterBreak="0">
-    <w:nsid w:val="271B72DB"/>
+  <w:abstractNum w:abstractNumId="8" w15:restartNumberingAfterBreak="0">
+    <w:nsid w:val="243E2904"/>
     <w:multiLevelType w:val="multilevel"/>
-    <w:tmpl w:val="3D544CF6"/>
+    <w:tmpl w:val="630C384A"/>
     <w:lvl w:ilvl="0">
-      <w:start w:val="1"/>
+      <w:start w:val="3"/>
       <w:numFmt w:val="decimal"/>
       <w:lvlText w:val="%1."/>
       <w:lvlJc w:val="left"/>
@@ -22574,10 +24236,10 @@
       </w:pPr>
     </w:lvl>
   </w:abstractNum>
-  <w:abstractNum w:abstractNumId="10" w15:restartNumberingAfterBreak="0">
-    <w:nsid w:val="2F772A7E"/>
+  <w:abstractNum w:abstractNumId="9" w15:restartNumberingAfterBreak="0">
+    <w:nsid w:val="24AF16C0"/>
     <w:multiLevelType w:val="multilevel"/>
-    <w:tmpl w:val="D2B6456E"/>
+    <w:tmpl w:val="F3BAE06E"/>
     <w:lvl w:ilvl="0">
       <w:start w:val="1"/>
       <w:numFmt w:val="bullet"/>
@@ -22723,10 +24385,123 @@
       </w:rPr>
     </w:lvl>
   </w:abstractNum>
+  <w:abstractNum w:abstractNumId="10" w15:restartNumberingAfterBreak="0">
+    <w:nsid w:val="271B72DB"/>
+    <w:multiLevelType w:val="multilevel"/>
+    <w:tmpl w:val="3D544CF6"/>
+    <w:lvl w:ilvl="0">
+      <w:start w:val="1"/>
+      <w:numFmt w:val="decimal"/>
+      <w:lvlText w:val="%1."/>
+      <w:lvlJc w:val="left"/>
+      <w:pPr>
+        <w:tabs>
+          <w:tab w:val="num" w:pos="720"/>
+        </w:tabs>
+        <w:ind w:left="720" w:hanging="360"/>
+      </w:pPr>
+    </w:lvl>
+    <w:lvl w:ilvl="1" w:tentative="1">
+      <w:start w:val="1"/>
+      <w:numFmt w:val="decimal"/>
+      <w:lvlText w:val="%2."/>
+      <w:lvlJc w:val="left"/>
+      <w:pPr>
+        <w:tabs>
+          <w:tab w:val="num" w:pos="1440"/>
+        </w:tabs>
+        <w:ind w:left="1440" w:hanging="360"/>
+      </w:pPr>
+    </w:lvl>
+    <w:lvl w:ilvl="2" w:tentative="1">
+      <w:start w:val="1"/>
+      <w:numFmt w:val="decimal"/>
+      <w:lvlText w:val="%3."/>
+      <w:lvlJc w:val="left"/>
+      <w:pPr>
+        <w:tabs>
+          <w:tab w:val="num" w:pos="2160"/>
+        </w:tabs>
+        <w:ind w:left="2160" w:hanging="360"/>
+      </w:pPr>
+    </w:lvl>
+    <w:lvl w:ilvl="3" w:tentative="1">
+      <w:start w:val="1"/>
+      <w:numFmt w:val="decimal"/>
+      <w:lvlText w:val="%4."/>
+      <w:lvlJc w:val="left"/>
+      <w:pPr>
+        <w:tabs>
+          <w:tab w:val="num" w:pos="2880"/>
+        </w:tabs>
+        <w:ind w:left="2880" w:hanging="360"/>
+      </w:pPr>
+    </w:lvl>
+    <w:lvl w:ilvl="4" w:tentative="1">
+      <w:start w:val="1"/>
+      <w:numFmt w:val="decimal"/>
+      <w:lvlText w:val="%5."/>
+      <w:lvlJc w:val="left"/>
+      <w:pPr>
+        <w:tabs>
+          <w:tab w:val="num" w:pos="3600"/>
+        </w:tabs>
+        <w:ind w:left="3600" w:hanging="360"/>
+      </w:pPr>
+    </w:lvl>
+    <w:lvl w:ilvl="5" w:tentative="1">
+      <w:start w:val="1"/>
+      <w:numFmt w:val="decimal"/>
+      <w:lvlText w:val="%6."/>
+      <w:lvlJc w:val="left"/>
+      <w:pPr>
+        <w:tabs>
+          <w:tab w:val="num" w:pos="4320"/>
+        </w:tabs>
+        <w:ind w:left="4320" w:hanging="360"/>
+      </w:pPr>
+    </w:lvl>
+    <w:lvl w:ilvl="6" w:tentative="1">
+      <w:start w:val="1"/>
+      <w:numFmt w:val="decimal"/>
+      <w:lvlText w:val="%7."/>
+      <w:lvlJc w:val="left"/>
+      <w:pPr>
+        <w:tabs>
+          <w:tab w:val="num" w:pos="5040"/>
+        </w:tabs>
+        <w:ind w:left="5040" w:hanging="360"/>
+      </w:pPr>
+    </w:lvl>
+    <w:lvl w:ilvl="7" w:tentative="1">
+      <w:start w:val="1"/>
+      <w:numFmt w:val="decimal"/>
+      <w:lvlText w:val="%8."/>
+      <w:lvlJc w:val="left"/>
+      <w:pPr>
+        <w:tabs>
+          <w:tab w:val="num" w:pos="5760"/>
+        </w:tabs>
+        <w:ind w:left="5760" w:hanging="360"/>
+      </w:pPr>
+    </w:lvl>
+    <w:lvl w:ilvl="8" w:tentative="1">
+      <w:start w:val="1"/>
+      <w:numFmt w:val="decimal"/>
+      <w:lvlText w:val="%9."/>
+      <w:lvlJc w:val="left"/>
+      <w:pPr>
+        <w:tabs>
+          <w:tab w:val="num" w:pos="6480"/>
+        </w:tabs>
+        <w:ind w:left="6480" w:hanging="360"/>
+      </w:pPr>
+    </w:lvl>
+  </w:abstractNum>
   <w:abstractNum w:abstractNumId="11" w15:restartNumberingAfterBreak="0">
-    <w:nsid w:val="2FEE0B00"/>
+    <w:nsid w:val="2F772A7E"/>
     <w:multiLevelType w:val="multilevel"/>
-    <w:tmpl w:val="7528FB6E"/>
+    <w:tmpl w:val="D2B6456E"/>
     <w:lvl w:ilvl="0">
       <w:start w:val="1"/>
       <w:numFmt w:val="bullet"/>
@@ -22873,9 +24648,9 @@
     </w:lvl>
   </w:abstractNum>
   <w:abstractNum w:abstractNumId="12" w15:restartNumberingAfterBreak="0">
-    <w:nsid w:val="3588615B"/>
+    <w:nsid w:val="2FEE0B00"/>
     <w:multiLevelType w:val="multilevel"/>
-    <w:tmpl w:val="49B2A80C"/>
+    <w:tmpl w:val="7528FB6E"/>
     <w:lvl w:ilvl="0">
       <w:start w:val="1"/>
       <w:numFmt w:val="bullet"/>
@@ -23022,9 +24797,9 @@
     </w:lvl>
   </w:abstractNum>
   <w:abstractNum w:abstractNumId="13" w15:restartNumberingAfterBreak="0">
-    <w:nsid w:val="3C141B4E"/>
+    <w:nsid w:val="3588615B"/>
     <w:multiLevelType w:val="multilevel"/>
-    <w:tmpl w:val="8244D9CE"/>
+    <w:tmpl w:val="49B2A80C"/>
     <w:lvl w:ilvl="0">
       <w:start w:val="1"/>
       <w:numFmt w:val="bullet"/>
@@ -23171,122 +24946,9 @@
     </w:lvl>
   </w:abstractNum>
   <w:abstractNum w:abstractNumId="14" w15:restartNumberingAfterBreak="0">
-    <w:nsid w:val="3E20107A"/>
+    <w:nsid w:val="3C141B4E"/>
     <w:multiLevelType w:val="multilevel"/>
-    <w:tmpl w:val="7C4E3600"/>
-    <w:lvl w:ilvl="0">
-      <w:start w:val="1"/>
-      <w:numFmt w:val="decimal"/>
-      <w:lvlText w:val="%1."/>
-      <w:lvlJc w:val="left"/>
-      <w:pPr>
-        <w:tabs>
-          <w:tab w:val="num" w:pos="720"/>
-        </w:tabs>
-        <w:ind w:left="720" w:hanging="360"/>
-      </w:pPr>
-    </w:lvl>
-    <w:lvl w:ilvl="1" w:tentative="1">
-      <w:start w:val="1"/>
-      <w:numFmt w:val="decimal"/>
-      <w:lvlText w:val="%2."/>
-      <w:lvlJc w:val="left"/>
-      <w:pPr>
-        <w:tabs>
-          <w:tab w:val="num" w:pos="1440"/>
-        </w:tabs>
-        <w:ind w:left="1440" w:hanging="360"/>
-      </w:pPr>
-    </w:lvl>
-    <w:lvl w:ilvl="2" w:tentative="1">
-      <w:start w:val="1"/>
-      <w:numFmt w:val="decimal"/>
-      <w:lvlText w:val="%3."/>
-      <w:lvlJc w:val="left"/>
-      <w:pPr>
-        <w:tabs>
-          <w:tab w:val="num" w:pos="2160"/>
-        </w:tabs>
-        <w:ind w:left="2160" w:hanging="360"/>
-      </w:pPr>
-    </w:lvl>
-    <w:lvl w:ilvl="3" w:tentative="1">
-      <w:start w:val="1"/>
-      <w:numFmt w:val="decimal"/>
-      <w:lvlText w:val="%4."/>
-      <w:lvlJc w:val="left"/>
-      <w:pPr>
-        <w:tabs>
-          <w:tab w:val="num" w:pos="2880"/>
-        </w:tabs>
-        <w:ind w:left="2880" w:hanging="360"/>
-      </w:pPr>
-    </w:lvl>
-    <w:lvl w:ilvl="4" w:tentative="1">
-      <w:start w:val="1"/>
-      <w:numFmt w:val="decimal"/>
-      <w:lvlText w:val="%5."/>
-      <w:lvlJc w:val="left"/>
-      <w:pPr>
-        <w:tabs>
-          <w:tab w:val="num" w:pos="3600"/>
-        </w:tabs>
-        <w:ind w:left="3600" w:hanging="360"/>
-      </w:pPr>
-    </w:lvl>
-    <w:lvl w:ilvl="5" w:tentative="1">
-      <w:start w:val="1"/>
-      <w:numFmt w:val="decimal"/>
-      <w:lvlText w:val="%6."/>
-      <w:lvlJc w:val="left"/>
-      <w:pPr>
-        <w:tabs>
-          <w:tab w:val="num" w:pos="4320"/>
-        </w:tabs>
-        <w:ind w:left="4320" w:hanging="360"/>
-      </w:pPr>
-    </w:lvl>
-    <w:lvl w:ilvl="6" w:tentative="1">
-      <w:start w:val="1"/>
-      <w:numFmt w:val="decimal"/>
-      <w:lvlText w:val="%7."/>
-      <w:lvlJc w:val="left"/>
-      <w:pPr>
-        <w:tabs>
-          <w:tab w:val="num" w:pos="5040"/>
-        </w:tabs>
-        <w:ind w:left="5040" w:hanging="360"/>
-      </w:pPr>
-    </w:lvl>
-    <w:lvl w:ilvl="7" w:tentative="1">
-      <w:start w:val="1"/>
-      <w:numFmt w:val="decimal"/>
-      <w:lvlText w:val="%8."/>
-      <w:lvlJc w:val="left"/>
-      <w:pPr>
-        <w:tabs>
-          <w:tab w:val="num" w:pos="5760"/>
-        </w:tabs>
-        <w:ind w:left="5760" w:hanging="360"/>
-      </w:pPr>
-    </w:lvl>
-    <w:lvl w:ilvl="8" w:tentative="1">
-      <w:start w:val="1"/>
-      <w:numFmt w:val="decimal"/>
-      <w:lvlText w:val="%9."/>
-      <w:lvlJc w:val="left"/>
-      <w:pPr>
-        <w:tabs>
-          <w:tab w:val="num" w:pos="6480"/>
-        </w:tabs>
-        <w:ind w:left="6480" w:hanging="360"/>
-      </w:pPr>
-    </w:lvl>
-  </w:abstractNum>
-  <w:abstractNum w:abstractNumId="15" w15:restartNumberingAfterBreak="0">
-    <w:nsid w:val="3FFC70C6"/>
-    <w:multiLevelType w:val="multilevel"/>
-    <w:tmpl w:val="47B20D90"/>
+    <w:tmpl w:val="8244D9CE"/>
     <w:lvl w:ilvl="0">
       <w:start w:val="1"/>
       <w:numFmt w:val="bullet"/>
@@ -23432,10 +25094,10 @@
       </w:rPr>
     </w:lvl>
   </w:abstractNum>
-  <w:abstractNum w:abstractNumId="16" w15:restartNumberingAfterBreak="0">
-    <w:nsid w:val="47A07AFD"/>
+  <w:abstractNum w:abstractNumId="15" w15:restartNumberingAfterBreak="0">
+    <w:nsid w:val="3E20107A"/>
     <w:multiLevelType w:val="multilevel"/>
-    <w:tmpl w:val="07687CB2"/>
+    <w:tmpl w:val="7C4E3600"/>
     <w:lvl w:ilvl="0">
       <w:start w:val="1"/>
       <w:numFmt w:val="decimal"/>
@@ -23545,10 +25207,10 @@
       </w:pPr>
     </w:lvl>
   </w:abstractNum>
-  <w:abstractNum w:abstractNumId="17" w15:restartNumberingAfterBreak="0">
-    <w:nsid w:val="484A7932"/>
+  <w:abstractNum w:abstractNumId="16" w15:restartNumberingAfterBreak="0">
+    <w:nsid w:val="3FFC70C6"/>
     <w:multiLevelType w:val="multilevel"/>
-    <w:tmpl w:val="7FC0743C"/>
+    <w:tmpl w:val="47B20D90"/>
     <w:lvl w:ilvl="0">
       <w:start w:val="1"/>
       <w:numFmt w:val="bullet"/>
@@ -23694,10 +25356,10 @@
       </w:rPr>
     </w:lvl>
   </w:abstractNum>
-  <w:abstractNum w:abstractNumId="18" w15:restartNumberingAfterBreak="0">
-    <w:nsid w:val="4A7115C2"/>
+  <w:abstractNum w:abstractNumId="17" w15:restartNumberingAfterBreak="0">
+    <w:nsid w:val="47A07AFD"/>
     <w:multiLevelType w:val="multilevel"/>
-    <w:tmpl w:val="D8FE3B12"/>
+    <w:tmpl w:val="07687CB2"/>
     <w:lvl w:ilvl="0">
       <w:start w:val="1"/>
       <w:numFmt w:val="decimal"/>
@@ -23807,10 +25469,10 @@
       </w:pPr>
     </w:lvl>
   </w:abstractNum>
-  <w:abstractNum w:abstractNumId="19" w15:restartNumberingAfterBreak="0">
-    <w:nsid w:val="53174EF0"/>
+  <w:abstractNum w:abstractNumId="18" w15:restartNumberingAfterBreak="0">
+    <w:nsid w:val="47D572D4"/>
     <w:multiLevelType w:val="multilevel"/>
-    <w:tmpl w:val="12A80CE2"/>
+    <w:tmpl w:val="E028EC4A"/>
     <w:lvl w:ilvl="0">
       <w:start w:val="1"/>
       <w:numFmt w:val="bullet"/>
@@ -23956,10 +25618,10 @@
       </w:rPr>
     </w:lvl>
   </w:abstractNum>
-  <w:abstractNum w:abstractNumId="20" w15:restartNumberingAfterBreak="0">
-    <w:nsid w:val="5A0C505A"/>
+  <w:abstractNum w:abstractNumId="19" w15:restartNumberingAfterBreak="0">
+    <w:nsid w:val="484A7932"/>
     <w:multiLevelType w:val="multilevel"/>
-    <w:tmpl w:val="C39A8AAA"/>
+    <w:tmpl w:val="7FC0743C"/>
     <w:lvl w:ilvl="0">
       <w:start w:val="1"/>
       <w:numFmt w:val="bullet"/>
@@ -24105,10 +25767,123 @@
       </w:rPr>
     </w:lvl>
   </w:abstractNum>
+  <w:abstractNum w:abstractNumId="20" w15:restartNumberingAfterBreak="0">
+    <w:nsid w:val="4A7115C2"/>
+    <w:multiLevelType w:val="multilevel"/>
+    <w:tmpl w:val="D8FE3B12"/>
+    <w:lvl w:ilvl="0">
+      <w:start w:val="1"/>
+      <w:numFmt w:val="decimal"/>
+      <w:lvlText w:val="%1."/>
+      <w:lvlJc w:val="left"/>
+      <w:pPr>
+        <w:tabs>
+          <w:tab w:val="num" w:pos="720"/>
+        </w:tabs>
+        <w:ind w:left="720" w:hanging="360"/>
+      </w:pPr>
+    </w:lvl>
+    <w:lvl w:ilvl="1" w:tentative="1">
+      <w:start w:val="1"/>
+      <w:numFmt w:val="decimal"/>
+      <w:lvlText w:val="%2."/>
+      <w:lvlJc w:val="left"/>
+      <w:pPr>
+        <w:tabs>
+          <w:tab w:val="num" w:pos="1440"/>
+        </w:tabs>
+        <w:ind w:left="1440" w:hanging="360"/>
+      </w:pPr>
+    </w:lvl>
+    <w:lvl w:ilvl="2" w:tentative="1">
+      <w:start w:val="1"/>
+      <w:numFmt w:val="decimal"/>
+      <w:lvlText w:val="%3."/>
+      <w:lvlJc w:val="left"/>
+      <w:pPr>
+        <w:tabs>
+          <w:tab w:val="num" w:pos="2160"/>
+        </w:tabs>
+        <w:ind w:left="2160" w:hanging="360"/>
+      </w:pPr>
+    </w:lvl>
+    <w:lvl w:ilvl="3" w:tentative="1">
+      <w:start w:val="1"/>
+      <w:numFmt w:val="decimal"/>
+      <w:lvlText w:val="%4."/>
+      <w:lvlJc w:val="left"/>
+      <w:pPr>
+        <w:tabs>
+          <w:tab w:val="num" w:pos="2880"/>
+        </w:tabs>
+        <w:ind w:left="2880" w:hanging="360"/>
+      </w:pPr>
+    </w:lvl>
+    <w:lvl w:ilvl="4" w:tentative="1">
+      <w:start w:val="1"/>
+      <w:numFmt w:val="decimal"/>
+      <w:lvlText w:val="%5."/>
+      <w:lvlJc w:val="left"/>
+      <w:pPr>
+        <w:tabs>
+          <w:tab w:val="num" w:pos="3600"/>
+        </w:tabs>
+        <w:ind w:left="3600" w:hanging="360"/>
+      </w:pPr>
+    </w:lvl>
+    <w:lvl w:ilvl="5" w:tentative="1">
+      <w:start w:val="1"/>
+      <w:numFmt w:val="decimal"/>
+      <w:lvlText w:val="%6."/>
+      <w:lvlJc w:val="left"/>
+      <w:pPr>
+        <w:tabs>
+          <w:tab w:val="num" w:pos="4320"/>
+        </w:tabs>
+        <w:ind w:left="4320" w:hanging="360"/>
+      </w:pPr>
+    </w:lvl>
+    <w:lvl w:ilvl="6" w:tentative="1">
+      <w:start w:val="1"/>
+      <w:numFmt w:val="decimal"/>
+      <w:lvlText w:val="%7."/>
+      <w:lvlJc w:val="left"/>
+      <w:pPr>
+        <w:tabs>
+          <w:tab w:val="num" w:pos="5040"/>
+        </w:tabs>
+        <w:ind w:left="5040" w:hanging="360"/>
+      </w:pPr>
+    </w:lvl>
+    <w:lvl w:ilvl="7" w:tentative="1">
+      <w:start w:val="1"/>
+      <w:numFmt w:val="decimal"/>
+      <w:lvlText w:val="%8."/>
+      <w:lvlJc w:val="left"/>
+      <w:pPr>
+        <w:tabs>
+          <w:tab w:val="num" w:pos="5760"/>
+        </w:tabs>
+        <w:ind w:left="5760" w:hanging="360"/>
+      </w:pPr>
+    </w:lvl>
+    <w:lvl w:ilvl="8" w:tentative="1">
+      <w:start w:val="1"/>
+      <w:numFmt w:val="decimal"/>
+      <w:lvlText w:val="%9."/>
+      <w:lvlJc w:val="left"/>
+      <w:pPr>
+        <w:tabs>
+          <w:tab w:val="num" w:pos="6480"/>
+        </w:tabs>
+        <w:ind w:left="6480" w:hanging="360"/>
+      </w:pPr>
+    </w:lvl>
+  </w:abstractNum>
   <w:abstractNum w:abstractNumId="21" w15:restartNumberingAfterBreak="0">
-    <w:nsid w:val="60706CFF"/>
+    <w:nsid w:val="53174EF0"/>
     <w:multiLevelType w:val="multilevel"/>
-    <w:tmpl w:val="66484520"/>
+    <w:tmpl w:val="12A80CE2"/>
     <w:lvl w:ilvl="0">
       <w:start w:val="1"/>
       <w:numFmt w:val="bullet"/>
@@ -24255,122 +26030,9 @@
     </w:lvl>
   </w:abstractNum>
   <w:abstractNum w:abstractNumId="22" w15:restartNumberingAfterBreak="0">
-    <w:nsid w:val="6DAE0D7B"/>
+    <w:nsid w:val="56303F86"/>
     <w:multiLevelType w:val="multilevel"/>
-    <w:tmpl w:val="9F6A47F4"/>
-    <w:lvl w:ilvl="0">
-      <w:start w:val="1"/>
-      <w:numFmt w:val="decimal"/>
-      <w:lvlText w:val="%1."/>
-      <w:lvlJc w:val="left"/>
-      <w:pPr>
-        <w:tabs>
-          <w:tab w:val="num" w:pos="720"/>
-        </w:tabs>
-        <w:ind w:left="720" w:hanging="360"/>
-      </w:pPr>
-    </w:lvl>
-    <w:lvl w:ilvl="1" w:tentative="1">
-      <w:start w:val="1"/>
-      <w:numFmt w:val="decimal"/>
-      <w:lvlText w:val="%2."/>
-      <w:lvlJc w:val="left"/>
-      <w:pPr>
-        <w:tabs>
-          <w:tab w:val="num" w:pos="1440"/>
-        </w:tabs>
-        <w:ind w:left="1440" w:hanging="360"/>
-      </w:pPr>
-    </w:lvl>
-    <w:lvl w:ilvl="2" w:tentative="1">
-      <w:start w:val="1"/>
-      <w:numFmt w:val="decimal"/>
-      <w:lvlText w:val="%3."/>
-      <w:lvlJc w:val="left"/>
-      <w:pPr>
-        <w:tabs>
-          <w:tab w:val="num" w:pos="2160"/>
-        </w:tabs>
-        <w:ind w:left="2160" w:hanging="360"/>
-      </w:pPr>
-    </w:lvl>
-    <w:lvl w:ilvl="3" w:tentative="1">
-      <w:start w:val="1"/>
-      <w:numFmt w:val="decimal"/>
-      <w:lvlText w:val="%4."/>
-      <w:lvlJc w:val="left"/>
-      <w:pPr>
-        <w:tabs>
-          <w:tab w:val="num" w:pos="2880"/>
-        </w:tabs>
-        <w:ind w:left="2880" w:hanging="360"/>
-      </w:pPr>
-    </w:lvl>
-    <w:lvl w:ilvl="4" w:tentative="1">
-      <w:start w:val="1"/>
-      <w:numFmt w:val="decimal"/>
-      <w:lvlText w:val="%5."/>
-      <w:lvlJc w:val="left"/>
-      <w:pPr>
-        <w:tabs>
-          <w:tab w:val="num" w:pos="3600"/>
-        </w:tabs>
-        <w:ind w:left="3600" w:hanging="360"/>
-      </w:pPr>
-    </w:lvl>
-    <w:lvl w:ilvl="5" w:tentative="1">
-      <w:start w:val="1"/>
-      <w:numFmt w:val="decimal"/>
-      <w:lvlText w:val="%6."/>
-      <w:lvlJc w:val="left"/>
-      <w:pPr>
-        <w:tabs>
-          <w:tab w:val="num" w:pos="4320"/>
-        </w:tabs>
-        <w:ind w:left="4320" w:hanging="360"/>
-      </w:pPr>
-    </w:lvl>
-    <w:lvl w:ilvl="6" w:tentative="1">
-      <w:start w:val="1"/>
-      <w:numFmt w:val="decimal"/>
-      <w:lvlText w:val="%7."/>
-      <w:lvlJc w:val="left"/>
-      <w:pPr>
-        <w:tabs>
-          <w:tab w:val="num" w:pos="5040"/>
-        </w:tabs>
-        <w:ind w:left="5040" w:hanging="360"/>
-      </w:pPr>
-    </w:lvl>
-    <w:lvl w:ilvl="7" w:tentative="1">
-      <w:start w:val="1"/>
-      <w:numFmt w:val="decimal"/>
-      <w:lvlText w:val="%8."/>
-      <w:lvlJc w:val="left"/>
-      <w:pPr>
-        <w:tabs>
-          <w:tab w:val="num" w:pos="5760"/>
-        </w:tabs>
-        <w:ind w:left="5760" w:hanging="360"/>
-      </w:pPr>
-    </w:lvl>
-    <w:lvl w:ilvl="8" w:tentative="1">
-      <w:start w:val="1"/>
-      <w:numFmt w:val="decimal"/>
-      <w:lvlText w:val="%9."/>
-      <w:lvlJc w:val="left"/>
-      <w:pPr>
-        <w:tabs>
-          <w:tab w:val="num" w:pos="6480"/>
-        </w:tabs>
-        <w:ind w:left="6480" w:hanging="360"/>
-      </w:pPr>
-    </w:lvl>
-  </w:abstractNum>
-  <w:abstractNum w:abstractNumId="23" w15:restartNumberingAfterBreak="0">
-    <w:nsid w:val="6DC9761C"/>
-    <w:multiLevelType w:val="multilevel"/>
-    <w:tmpl w:val="A1EE961A"/>
+    <w:tmpl w:val="64FA5E8E"/>
     <w:lvl w:ilvl="0">
       <w:start w:val="1"/>
       <w:numFmt w:val="bullet"/>
@@ -24516,10 +26178,10 @@
       </w:rPr>
     </w:lvl>
   </w:abstractNum>
-  <w:abstractNum w:abstractNumId="24" w15:restartNumberingAfterBreak="0">
-    <w:nsid w:val="76EE602D"/>
+  <w:abstractNum w:abstractNumId="23" w15:restartNumberingAfterBreak="0">
+    <w:nsid w:val="5A0C505A"/>
     <w:multiLevelType w:val="multilevel"/>
-    <w:tmpl w:val="F5F69748"/>
+    <w:tmpl w:val="C39A8AAA"/>
     <w:lvl w:ilvl="0">
       <w:start w:val="1"/>
       <w:numFmt w:val="bullet"/>
@@ -24665,10 +26327,10 @@
       </w:rPr>
     </w:lvl>
   </w:abstractNum>
-  <w:abstractNum w:abstractNumId="25" w15:restartNumberingAfterBreak="0">
-    <w:nsid w:val="77E42BD7"/>
+  <w:abstractNum w:abstractNumId="24" w15:restartNumberingAfterBreak="0">
+    <w:nsid w:val="60706CFF"/>
     <w:multiLevelType w:val="multilevel"/>
-    <w:tmpl w:val="0FCAF91C"/>
+    <w:tmpl w:val="66484520"/>
     <w:lvl w:ilvl="0">
       <w:start w:val="1"/>
       <w:numFmt w:val="bullet"/>
@@ -24814,10 +26476,123 @@
       </w:rPr>
     </w:lvl>
   </w:abstractNum>
+  <w:abstractNum w:abstractNumId="25" w15:restartNumberingAfterBreak="0">
+    <w:nsid w:val="6DAE0D7B"/>
+    <w:multiLevelType w:val="multilevel"/>
+    <w:tmpl w:val="9F6A47F4"/>
+    <w:lvl w:ilvl="0">
+      <w:start w:val="1"/>
+      <w:numFmt w:val="decimal"/>
+      <w:lvlText w:val="%1."/>
+      <w:lvlJc w:val="left"/>
+      <w:pPr>
+        <w:tabs>
+          <w:tab w:val="num" w:pos="720"/>
+        </w:tabs>
+        <w:ind w:left="720" w:hanging="360"/>
+      </w:pPr>
+    </w:lvl>
+    <w:lvl w:ilvl="1" w:tentative="1">
+      <w:start w:val="1"/>
+      <w:numFmt w:val="decimal"/>
+      <w:lvlText w:val="%2."/>
+      <w:lvlJc w:val="left"/>
+      <w:pPr>
+        <w:tabs>
+          <w:tab w:val="num" w:pos="1440"/>
+        </w:tabs>
+        <w:ind w:left="1440" w:hanging="360"/>
+      </w:pPr>
+    </w:lvl>
+    <w:lvl w:ilvl="2" w:tentative="1">
+      <w:start w:val="1"/>
+      <w:numFmt w:val="decimal"/>
+      <w:lvlText w:val="%3."/>
+      <w:lvlJc w:val="left"/>
+      <w:pPr>
+        <w:tabs>
+          <w:tab w:val="num" w:pos="2160"/>
+        </w:tabs>
+        <w:ind w:left="2160" w:hanging="360"/>
+      </w:pPr>
+    </w:lvl>
+    <w:lvl w:ilvl="3" w:tentative="1">
+      <w:start w:val="1"/>
+      <w:numFmt w:val="decimal"/>
+      <w:lvlText w:val="%4."/>
+      <w:lvlJc w:val="left"/>
+      <w:pPr>
+        <w:tabs>
+          <w:tab w:val="num" w:pos="2880"/>
+        </w:tabs>
+        <w:ind w:left="2880" w:hanging="360"/>
+      </w:pPr>
+    </w:lvl>
+    <w:lvl w:ilvl="4" w:tentative="1">
+      <w:start w:val="1"/>
+      <w:numFmt w:val="decimal"/>
+      <w:lvlText w:val="%5."/>
+      <w:lvlJc w:val="left"/>
+      <w:pPr>
+        <w:tabs>
+          <w:tab w:val="num" w:pos="3600"/>
+        </w:tabs>
+        <w:ind w:left="3600" w:hanging="360"/>
+      </w:pPr>
+    </w:lvl>
+    <w:lvl w:ilvl="5" w:tentative="1">
+      <w:start w:val="1"/>
+      <w:numFmt w:val="decimal"/>
+      <w:lvlText w:val="%6."/>
+      <w:lvlJc w:val="left"/>
+      <w:pPr>
+        <w:tabs>
+          <w:tab w:val="num" w:pos="4320"/>
+        </w:tabs>
+        <w:ind w:left="4320" w:hanging="360"/>
+      </w:pPr>
+    </w:lvl>
+    <w:lvl w:ilvl="6" w:tentative="1">
+      <w:start w:val="1"/>
+      <w:numFmt w:val="decimal"/>
+      <w:lvlText w:val="%7."/>
+      <w:lvlJc w:val="left"/>
+      <w:pPr>
+        <w:tabs>
+          <w:tab w:val="num" w:pos="5040"/>
+        </w:tabs>
+        <w:ind w:left="5040" w:hanging="360"/>
+      </w:pPr>
+    </w:lvl>
+    <w:lvl w:ilvl="7" w:tentative="1">
+      <w:start w:val="1"/>
+      <w:numFmt w:val="decimal"/>
+      <w:lvlText w:val="%8."/>
+      <w:lvlJc w:val="left"/>
+      <w:pPr>
+        <w:tabs>
+          <w:tab w:val="num" w:pos="5760"/>
+        </w:tabs>
+        <w:ind w:left="5760" w:hanging="360"/>
+      </w:pPr>
+    </w:lvl>
+    <w:lvl w:ilvl="8" w:tentative="1">
+      <w:start w:val="1"/>
+      <w:numFmt w:val="decimal"/>
+      <w:lvlText w:val="%9."/>
+      <w:lvlJc w:val="left"/>
+      <w:pPr>
+        <w:tabs>
+          <w:tab w:val="num" w:pos="6480"/>
+        </w:tabs>
+        <w:ind w:left="6480" w:hanging="360"/>
+      </w:pPr>
+    </w:lvl>
+  </w:abstractNum>
   <w:abstractNum w:abstractNumId="26" w15:restartNumberingAfterBreak="0">
-    <w:nsid w:val="7E2221DE"/>
+    <w:nsid w:val="6DC9761C"/>
     <w:multiLevelType w:val="multilevel"/>
-    <w:tmpl w:val="0C2AFD40"/>
+    <w:tmpl w:val="A1EE961A"/>
     <w:lvl w:ilvl="0">
       <w:start w:val="1"/>
       <w:numFmt w:val="bullet"/>
@@ -24963,47 +26738,494 @@
       </w:rPr>
     </w:lvl>
   </w:abstractNum>
+  <w:abstractNum w:abstractNumId="27" w15:restartNumberingAfterBreak="0">
+    <w:nsid w:val="76EE602D"/>
+    <w:multiLevelType w:val="multilevel"/>
+    <w:tmpl w:val="F5F69748"/>
+    <w:lvl w:ilvl="0">
+      <w:start w:val="1"/>
+      <w:numFmt w:val="bullet"/>
+      <w:lvlText w:val=""/>
+      <w:lvlJc w:val="left"/>
+      <w:pPr>
+        <w:tabs>
+          <w:tab w:val="num" w:pos="720"/>
+        </w:tabs>
+        <w:ind w:left="720" w:hanging="360"/>
+      </w:pPr>
+      <w:rPr>
+        <w:rFonts w:ascii="Symbol" w:hAnsi="Symbol" w:hint="default"/>
+        <w:sz w:val="20"/>
+      </w:rPr>
+    </w:lvl>
+    <w:lvl w:ilvl="1" w:tentative="1">
+      <w:start w:val="1"/>
+      <w:numFmt w:val="bullet"/>
+      <w:lvlText w:val="o"/>
+      <w:lvlJc w:val="left"/>
+      <w:pPr>
+        <w:tabs>
+          <w:tab w:val="num" w:pos="1440"/>
+        </w:tabs>
+        <w:ind w:left="1440" w:hanging="360"/>
+      </w:pPr>
+      <w:rPr>
+        <w:rFonts w:ascii="Courier New" w:hAnsi="Courier New" w:hint="default"/>
+        <w:sz w:val="20"/>
+      </w:rPr>
+    </w:lvl>
+    <w:lvl w:ilvl="2" w:tentative="1">
+      <w:start w:val="1"/>
+      <w:numFmt w:val="bullet"/>
+      <w:lvlText w:val=""/>
+      <w:lvlJc w:val="left"/>
+      <w:pPr>
+        <w:tabs>
+          <w:tab w:val="num" w:pos="2160"/>
+        </w:tabs>
+        <w:ind w:left="2160" w:hanging="360"/>
+      </w:pPr>
+      <w:rPr>
+        <w:rFonts w:ascii="Wingdings" w:hAnsi="Wingdings" w:hint="default"/>
+        <w:sz w:val="20"/>
+      </w:rPr>
+    </w:lvl>
+    <w:lvl w:ilvl="3" w:tentative="1">
+      <w:start w:val="1"/>
+      <w:numFmt w:val="bullet"/>
+      <w:lvlText w:val=""/>
+      <w:lvlJc w:val="left"/>
+      <w:pPr>
+        <w:tabs>
+          <w:tab w:val="num" w:pos="2880"/>
+        </w:tabs>
+        <w:ind w:left="2880" w:hanging="360"/>
+      </w:pPr>
+      <w:rPr>
+        <w:rFonts w:ascii="Wingdings" w:hAnsi="Wingdings" w:hint="default"/>
+        <w:sz w:val="20"/>
+      </w:rPr>
+    </w:lvl>
+    <w:lvl w:ilvl="4" w:tentative="1">
+      <w:start w:val="1"/>
+      <w:numFmt w:val="bullet"/>
+      <w:lvlText w:val=""/>
+      <w:lvlJc w:val="left"/>
+      <w:pPr>
+        <w:tabs>
+          <w:tab w:val="num" w:pos="3600"/>
+        </w:tabs>
+        <w:ind w:left="3600" w:hanging="360"/>
+      </w:pPr>
+      <w:rPr>
+        <w:rFonts w:ascii="Wingdings" w:hAnsi="Wingdings" w:hint="default"/>
+        <w:sz w:val="20"/>
+      </w:rPr>
+    </w:lvl>
+    <w:lvl w:ilvl="5" w:tentative="1">
+      <w:start w:val="1"/>
+      <w:numFmt w:val="bullet"/>
+      <w:lvlText w:val=""/>
+      <w:lvlJc w:val="left"/>
+      <w:pPr>
+        <w:tabs>
+          <w:tab w:val="num" w:pos="4320"/>
+        </w:tabs>
+        <w:ind w:left="4320" w:hanging="360"/>
+      </w:pPr>
+      <w:rPr>
+        <w:rFonts w:ascii="Wingdings" w:hAnsi="Wingdings" w:hint="default"/>
+        <w:sz w:val="20"/>
+      </w:rPr>
+    </w:lvl>
+    <w:lvl w:ilvl="6" w:tentative="1">
+      <w:start w:val="1"/>
+      <w:numFmt w:val="bullet"/>
+      <w:lvlText w:val=""/>
+      <w:lvlJc w:val="left"/>
+      <w:pPr>
+        <w:tabs>
+          <w:tab w:val="num" w:pos="5040"/>
+        </w:tabs>
+        <w:ind w:left="5040" w:hanging="360"/>
+      </w:pPr>
+      <w:rPr>
+        <w:rFonts w:ascii="Wingdings" w:hAnsi="Wingdings" w:hint="default"/>
+        <w:sz w:val="20"/>
+      </w:rPr>
+    </w:lvl>
+    <w:lvl w:ilvl="7" w:tentative="1">
+      <w:start w:val="1"/>
+      <w:numFmt w:val="bullet"/>
+      <w:lvlText w:val=""/>
+      <w:lvlJc w:val="left"/>
+      <w:pPr>
+        <w:tabs>
+          <w:tab w:val="num" w:pos="5760"/>
+        </w:tabs>
+        <w:ind w:left="5760" w:hanging="360"/>
+      </w:pPr>
+      <w:rPr>
+        <w:rFonts w:ascii="Wingdings" w:hAnsi="Wingdings" w:hint="default"/>
+        <w:sz w:val="20"/>
+      </w:rPr>
+    </w:lvl>
+    <w:lvl w:ilvl="8" w:tentative="1">
+      <w:start w:val="1"/>
+      <w:numFmt w:val="bullet"/>
+      <w:lvlText w:val=""/>
+      <w:lvlJc w:val="left"/>
+      <w:pPr>
+        <w:tabs>
+          <w:tab w:val="num" w:pos="6480"/>
+        </w:tabs>
+        <w:ind w:left="6480" w:hanging="360"/>
+      </w:pPr>
+      <w:rPr>
+        <w:rFonts w:ascii="Wingdings" w:hAnsi="Wingdings" w:hint="default"/>
+        <w:sz w:val="20"/>
+      </w:rPr>
+    </w:lvl>
+  </w:abstractNum>
+  <w:abstractNum w:abstractNumId="28" w15:restartNumberingAfterBreak="0">
+    <w:nsid w:val="77E42BD7"/>
+    <w:multiLevelType w:val="multilevel"/>
+    <w:tmpl w:val="0FCAF91C"/>
+    <w:lvl w:ilvl="0">
+      <w:start w:val="1"/>
+      <w:numFmt w:val="bullet"/>
+      <w:lvlText w:val=""/>
+      <w:lvlJc w:val="left"/>
+      <w:pPr>
+        <w:tabs>
+          <w:tab w:val="num" w:pos="720"/>
+        </w:tabs>
+        <w:ind w:left="720" w:hanging="360"/>
+      </w:pPr>
+      <w:rPr>
+        <w:rFonts w:ascii="Symbol" w:hAnsi="Symbol" w:hint="default"/>
+        <w:sz w:val="20"/>
+      </w:rPr>
+    </w:lvl>
+    <w:lvl w:ilvl="1" w:tentative="1">
+      <w:start w:val="1"/>
+      <w:numFmt w:val="bullet"/>
+      <w:lvlText w:val="o"/>
+      <w:lvlJc w:val="left"/>
+      <w:pPr>
+        <w:tabs>
+          <w:tab w:val="num" w:pos="1440"/>
+        </w:tabs>
+        <w:ind w:left="1440" w:hanging="360"/>
+      </w:pPr>
+      <w:rPr>
+        <w:rFonts w:ascii="Courier New" w:hAnsi="Courier New" w:hint="default"/>
+        <w:sz w:val="20"/>
+      </w:rPr>
+    </w:lvl>
+    <w:lvl w:ilvl="2" w:tentative="1">
+      <w:start w:val="1"/>
+      <w:numFmt w:val="bullet"/>
+      <w:lvlText w:val=""/>
+      <w:lvlJc w:val="left"/>
+      <w:pPr>
+        <w:tabs>
+          <w:tab w:val="num" w:pos="2160"/>
+        </w:tabs>
+        <w:ind w:left="2160" w:hanging="360"/>
+      </w:pPr>
+      <w:rPr>
+        <w:rFonts w:ascii="Wingdings" w:hAnsi="Wingdings" w:hint="default"/>
+        <w:sz w:val="20"/>
+      </w:rPr>
+    </w:lvl>
+    <w:lvl w:ilvl="3" w:tentative="1">
+      <w:start w:val="1"/>
+      <w:numFmt w:val="bullet"/>
+      <w:lvlText w:val=""/>
+      <w:lvlJc w:val="left"/>
+      <w:pPr>
+        <w:tabs>
+          <w:tab w:val="num" w:pos="2880"/>
+        </w:tabs>
+        <w:ind w:left="2880" w:hanging="360"/>
+      </w:pPr>
+      <w:rPr>
+        <w:rFonts w:ascii="Wingdings" w:hAnsi="Wingdings" w:hint="default"/>
+        <w:sz w:val="20"/>
+      </w:rPr>
+    </w:lvl>
+    <w:lvl w:ilvl="4" w:tentative="1">
+      <w:start w:val="1"/>
+      <w:numFmt w:val="bullet"/>
+      <w:lvlText w:val=""/>
+      <w:lvlJc w:val="left"/>
+      <w:pPr>
+        <w:tabs>
+          <w:tab w:val="num" w:pos="3600"/>
+        </w:tabs>
+        <w:ind w:left="3600" w:hanging="360"/>
+      </w:pPr>
+      <w:rPr>
+        <w:rFonts w:ascii="Wingdings" w:hAnsi="Wingdings" w:hint="default"/>
+        <w:sz w:val="20"/>
+      </w:rPr>
+    </w:lvl>
+    <w:lvl w:ilvl="5" w:tentative="1">
+      <w:start w:val="1"/>
+      <w:numFmt w:val="bullet"/>
+      <w:lvlText w:val=""/>
+      <w:lvlJc w:val="left"/>
+      <w:pPr>
+        <w:tabs>
+          <w:tab w:val="num" w:pos="4320"/>
+        </w:tabs>
+        <w:ind w:left="4320" w:hanging="360"/>
+      </w:pPr>
+      <w:rPr>
+        <w:rFonts w:ascii="Wingdings" w:hAnsi="Wingdings" w:hint="default"/>
+        <w:sz w:val="20"/>
+      </w:rPr>
+    </w:lvl>
+    <w:lvl w:ilvl="6" w:tentative="1">
+      <w:start w:val="1"/>
+      <w:numFmt w:val="bullet"/>
+      <w:lvlText w:val=""/>
+      <w:lvlJc w:val="left"/>
+      <w:pPr>
+        <w:tabs>
+          <w:tab w:val="num" w:pos="5040"/>
+        </w:tabs>
+        <w:ind w:left="5040" w:hanging="360"/>
+      </w:pPr>
+      <w:rPr>
+        <w:rFonts w:ascii="Wingdings" w:hAnsi="Wingdings" w:hint="default"/>
+        <w:sz w:val="20"/>
+      </w:rPr>
+    </w:lvl>
+    <w:lvl w:ilvl="7" w:tentative="1">
+      <w:start w:val="1"/>
+      <w:numFmt w:val="bullet"/>
+      <w:lvlText w:val=""/>
+      <w:lvlJc w:val="left"/>
+      <w:pPr>
+        <w:tabs>
+          <w:tab w:val="num" w:pos="5760"/>
+        </w:tabs>
+        <w:ind w:left="5760" w:hanging="360"/>
+      </w:pPr>
+      <w:rPr>
+        <w:rFonts w:ascii="Wingdings" w:hAnsi="Wingdings" w:hint="default"/>
+        <w:sz w:val="20"/>
+      </w:rPr>
+    </w:lvl>
+    <w:lvl w:ilvl="8" w:tentative="1">
+      <w:start w:val="1"/>
+      <w:numFmt w:val="bullet"/>
+      <w:lvlText w:val=""/>
+      <w:lvlJc w:val="left"/>
+      <w:pPr>
+        <w:tabs>
+          <w:tab w:val="num" w:pos="6480"/>
+        </w:tabs>
+        <w:ind w:left="6480" w:hanging="360"/>
+      </w:pPr>
+      <w:rPr>
+        <w:rFonts w:ascii="Wingdings" w:hAnsi="Wingdings" w:hint="default"/>
+        <w:sz w:val="20"/>
+      </w:rPr>
+    </w:lvl>
+  </w:abstractNum>
+  <w:abstractNum w:abstractNumId="29" w15:restartNumberingAfterBreak="0">
+    <w:nsid w:val="7E2221DE"/>
+    <w:multiLevelType w:val="multilevel"/>
+    <w:tmpl w:val="0C2AFD40"/>
+    <w:lvl w:ilvl="0">
+      <w:start w:val="1"/>
+      <w:numFmt w:val="bullet"/>
+      <w:lvlText w:val=""/>
+      <w:lvlJc w:val="left"/>
+      <w:pPr>
+        <w:tabs>
+          <w:tab w:val="num" w:pos="720"/>
+        </w:tabs>
+        <w:ind w:left="720" w:hanging="360"/>
+      </w:pPr>
+      <w:rPr>
+        <w:rFonts w:ascii="Symbol" w:hAnsi="Symbol" w:hint="default"/>
+        <w:sz w:val="20"/>
+      </w:rPr>
+    </w:lvl>
+    <w:lvl w:ilvl="1" w:tentative="1">
+      <w:start w:val="1"/>
+      <w:numFmt w:val="bullet"/>
+      <w:lvlText w:val="o"/>
+      <w:lvlJc w:val="left"/>
+      <w:pPr>
+        <w:tabs>
+          <w:tab w:val="num" w:pos="1440"/>
+        </w:tabs>
+        <w:ind w:left="1440" w:hanging="360"/>
+      </w:pPr>
+      <w:rPr>
+        <w:rFonts w:ascii="Courier New" w:hAnsi="Courier New" w:hint="default"/>
+        <w:sz w:val="20"/>
+      </w:rPr>
+    </w:lvl>
+    <w:lvl w:ilvl="2" w:tentative="1">
+      <w:start w:val="1"/>
+      <w:numFmt w:val="bullet"/>
+      <w:lvlText w:val=""/>
+      <w:lvlJc w:val="left"/>
+      <w:pPr>
+        <w:tabs>
+          <w:tab w:val="num" w:pos="2160"/>
+        </w:tabs>
+        <w:ind w:left="2160" w:hanging="360"/>
+      </w:pPr>
+      <w:rPr>
+        <w:rFonts w:ascii="Wingdings" w:hAnsi="Wingdings" w:hint="default"/>
+        <w:sz w:val="20"/>
+      </w:rPr>
+    </w:lvl>
+    <w:lvl w:ilvl="3" w:tentative="1">
+      <w:start w:val="1"/>
+      <w:numFmt w:val="bullet"/>
+      <w:lvlText w:val=""/>
+      <w:lvlJc w:val="left"/>
+      <w:pPr>
+        <w:tabs>
+          <w:tab w:val="num" w:pos="2880"/>
+        </w:tabs>
+        <w:ind w:left="2880" w:hanging="360"/>
+      </w:pPr>
+      <w:rPr>
+        <w:rFonts w:ascii="Wingdings" w:hAnsi="Wingdings" w:hint="default"/>
+        <w:sz w:val="20"/>
+      </w:rPr>
+    </w:lvl>
+    <w:lvl w:ilvl="4" w:tentative="1">
+      <w:start w:val="1"/>
+      <w:numFmt w:val="bullet"/>
+      <w:lvlText w:val=""/>
+      <w:lvlJc w:val="left"/>
+      <w:pPr>
+        <w:tabs>
+          <w:tab w:val="num" w:pos="3600"/>
+        </w:tabs>
+        <w:ind w:left="3600" w:hanging="360"/>
+      </w:pPr>
+      <w:rPr>
+        <w:rFonts w:ascii="Wingdings" w:hAnsi="Wingdings" w:hint="default"/>
+        <w:sz w:val="20"/>
+      </w:rPr>
+    </w:lvl>
+    <w:lvl w:ilvl="5" w:tentative="1">
+      <w:start w:val="1"/>
+      <w:numFmt w:val="bullet"/>
+      <w:lvlText w:val=""/>
+      <w:lvlJc w:val="left"/>
+      <w:pPr>
+        <w:tabs>
+          <w:tab w:val="num" w:pos="4320"/>
+        </w:tabs>
+        <w:ind w:left="4320" w:hanging="360"/>
+      </w:pPr>
+      <w:rPr>
+        <w:rFonts w:ascii="Wingdings" w:hAnsi="Wingdings" w:hint="default"/>
+        <w:sz w:val="20"/>
+      </w:rPr>
+    </w:lvl>
+    <w:lvl w:ilvl="6" w:tentative="1">
+      <w:start w:val="1"/>
+      <w:numFmt w:val="bullet"/>
+      <w:lvlText w:val=""/>
+      <w:lvlJc w:val="left"/>
+      <w:pPr>
+        <w:tabs>
+          <w:tab w:val="num" w:pos="5040"/>
+        </w:tabs>
+        <w:ind w:left="5040" w:hanging="360"/>
+      </w:pPr>
+      <w:rPr>
+        <w:rFonts w:ascii="Wingdings" w:hAnsi="Wingdings" w:hint="default"/>
+        <w:sz w:val="20"/>
+      </w:rPr>
+    </w:lvl>
+    <w:lvl w:ilvl="7" w:tentative="1">
+      <w:start w:val="1"/>
+      <w:numFmt w:val="bullet"/>
+      <w:lvlText w:val=""/>
+      <w:lvlJc w:val="left"/>
+      <w:pPr>
+        <w:tabs>
+          <w:tab w:val="num" w:pos="5760"/>
+        </w:tabs>
+        <w:ind w:left="5760" w:hanging="360"/>
+      </w:pPr>
+      <w:rPr>
+        <w:rFonts w:ascii="Wingdings" w:hAnsi="Wingdings" w:hint="default"/>
+        <w:sz w:val="20"/>
+      </w:rPr>
+    </w:lvl>
+    <w:lvl w:ilvl="8" w:tentative="1">
+      <w:start w:val="1"/>
+      <w:numFmt w:val="bullet"/>
+      <w:lvlText w:val=""/>
+      <w:lvlJc w:val="left"/>
+      <w:pPr>
+        <w:tabs>
+          <w:tab w:val="num" w:pos="6480"/>
+        </w:tabs>
+        <w:ind w:left="6480" w:hanging="360"/>
+      </w:pPr>
+      <w:rPr>
+        <w:rFonts w:ascii="Wingdings" w:hAnsi="Wingdings" w:hint="default"/>
+        <w:sz w:val="20"/>
+      </w:rPr>
+    </w:lvl>
+  </w:abstractNum>
   <w:num w:numId="1">
-    <w:abstractNumId w:val="26"/>
+    <w:abstractNumId w:val="29"/>
   </w:num>
   <w:num w:numId="2">
     <w:abstractNumId w:val="4"/>
   </w:num>
   <w:num w:numId="3">
-    <w:abstractNumId w:val="20"/>
+    <w:abstractNumId w:val="23"/>
   </w:num>
   <w:num w:numId="4">
     <w:abstractNumId w:val="0"/>
   </w:num>
   <w:num w:numId="5">
-    <w:abstractNumId w:val="16"/>
+    <w:abstractNumId w:val="17"/>
   </w:num>
   <w:num w:numId="6">
+    <w:abstractNumId w:val="11"/>
+  </w:num>
+  <w:num w:numId="7">
     <w:abstractNumId w:val="10"/>
   </w:num>
-  <w:num w:numId="7">
-    <w:abstractNumId w:val="9"/>
-  </w:num>
   <w:num w:numId="8">
-    <w:abstractNumId w:val="24"/>
+    <w:abstractNumId w:val="27"/>
   </w:num>
   <w:num w:numId="9">
-    <w:abstractNumId w:val="11"/>
+    <w:abstractNumId w:val="12"/>
   </w:num>
   <w:num w:numId="10">
-    <w:abstractNumId w:val="23"/>
+    <w:abstractNumId w:val="26"/>
   </w:num>
   <w:num w:numId="11">
-    <w:abstractNumId w:val="25"/>
+    <w:abstractNumId w:val="28"/>
   </w:num>
   <w:num w:numId="12">
-    <w:abstractNumId w:val="13"/>
+    <w:abstractNumId w:val="14"/>
   </w:num>
   <w:num w:numId="13">
-    <w:abstractNumId w:val="18"/>
+    <w:abstractNumId w:val="20"/>
   </w:num>
   <w:num w:numId="14">
-    <w:abstractNumId w:val="7"/>
+    <w:abstractNumId w:val="8"/>
   </w:num>
   <w:num w:numId="15">
     <w:abstractNumId w:val="6"/>
@@ -25012,37 +27234,46 @@
     <w:abstractNumId w:val="2"/>
   </w:num>
   <w:num w:numId="17">
-    <w:abstractNumId w:val="14"/>
+    <w:abstractNumId w:val="15"/>
   </w:num>
   <w:num w:numId="18">
     <w:abstractNumId w:val="5"/>
   </w:num>
   <w:num w:numId="19">
-    <w:abstractNumId w:val="22"/>
+    <w:abstractNumId w:val="25"/>
   </w:num>
   <w:num w:numId="20">
     <w:abstractNumId w:val="1"/>
   </w:num>
   <w:num w:numId="21">
-    <w:abstractNumId w:val="17"/>
+    <w:abstractNumId w:val="19"/>
   </w:num>
   <w:num w:numId="22">
-    <w:abstractNumId w:val="19"/>
+    <w:abstractNumId w:val="21"/>
   </w:num>
   <w:num w:numId="23">
-    <w:abstractNumId w:val="12"/>
+    <w:abstractNumId w:val="13"/>
   </w:num>
   <w:num w:numId="24">
-    <w:abstractNumId w:val="15"/>
+    <w:abstractNumId w:val="16"/>
   </w:num>
   <w:num w:numId="25">
-    <w:abstractNumId w:val="21"/>
+    <w:abstractNumId w:val="24"/>
   </w:num>
   <w:num w:numId="26">
     <w:abstractNumId w:val="3"/>
   </w:num>
   <w:num w:numId="27">
-    <w:abstractNumId w:val="8"/>
+    <w:abstractNumId w:val="9"/>
+  </w:num>
+  <w:num w:numId="28">
+    <w:abstractNumId w:val="22"/>
+  </w:num>
+  <w:num w:numId="29">
+    <w:abstractNumId w:val="7"/>
+  </w:num>
+  <w:num w:numId="30">
+    <w:abstractNumId w:val="18"/>
   </w:num>
 </w:numbering>
 </file>

</xml_diff>